<commit_message>
Update option E: confirm 2 lamps per number board
Co-Authored-By: Claude Opus 5.5 <noreply@anthropic.com>
Claude-Session: https://claude.ai/code/session_01SRofemskE9Ua3xffc2pfuH
</commit_message>
<xml_diff>
--- a/docs/iluminacion-led-74vcc/Opcion_E_Lampara_LED_Driver_74VCC.docx
+++ b/docs/iluminacion-led-74vcc/Opcion_E_Lampara_LED_Driver_74VCC.docx
@@ -3419,7 +3419,7 @@
         <w:autoSpaceDN w:val="0"/>
         <w:autoSpaceDE w:val="0"/>
         <w:widowControl/>
-        <w:spacing w:line="264" w:lineRule="auto" w:before="218" w:after="404"/>
+        <w:spacing w:line="271" w:lineRule="auto" w:before="218" w:after="404"/>
         <w:ind w:left="180" w:right="288" w:firstLine="0"/>
         <w:jc w:val="left"/>
       </w:pPr>
@@ -3431,7 +3431,7 @@
           <w:color w:val="1F1E1D"/>
           <w:sz w:val="24"/>
         </w:rPr>
-        <w:t xml:space="preserve">Se reemplazan 24 ampolletas por locomotora. El casquillo y la cantidad de ampolletas por </w:t>
+        <w:t xml:space="preserve">Se reemplazan 24 ampolletas por locomotora. La cantidad de ampolletas por numerador </w:t>
       </w:r>
       <w:r>
         <w:rPr>
@@ -3441,7 +3441,17 @@
           <w:color w:val="1F1E1D"/>
           <w:sz w:val="24"/>
         </w:rPr>
-        <w:t>numerador se suponen y deben confirmarse retirando una luminaria de cada tipo.</w:t>
+        <w:t xml:space="preserve">está confirmada (2 por tablero); el casquillo se supone y debe confirmarse retirando una </w:t>
+      </w:r>
+      <w:r>
+        <w:rPr>
+          <w:rFonts w:ascii="Anthropic Sans Print" w:hAnsi="Anthropic Sans Print" w:eastAsia="Anthropic Sans Print"/>
+          <w:b w:val="0"/>
+          <w:i w:val="0"/>
+          <w:color w:val="1F1E1D"/>
+          <w:sz w:val="24"/>
+        </w:rPr>
+        <w:t>luminaria de cada tipo.</w:t>
       </w:r>
     </w:p>
     <w:tbl>
@@ -3501,7 +3511,7 @@
         </w:tc>
         <w:tc>
           <w:tcPr>
-            <w:tcW w:type="dxa" w:w="1872"/>
+            <w:tcW w:type="dxa" w:w="1992"/>
             <w:tcBorders>
               <w:start w:sz="5.599999999999909" w:val="single" w:color="#E7E4DB"/>
               <w:top w:sz="5.599999999999909" w:val="single" w:color="#E7E4DB"/>
@@ -3520,7 +3530,7 @@
               <w:autoSpaceDE w:val="0"/>
               <w:widowControl/>
               <w:spacing w:line="262" w:lineRule="auto" w:before="106" w:after="0"/>
-              <w:ind w:left="144" w:right="144" w:firstLine="0"/>
+              <w:ind w:left="142" w:right="288" w:firstLine="0"/>
               <w:jc w:val="left"/>
             </w:pPr>
             <w:r>
@@ -3549,11 +3559,11 @@
         </w:tc>
         <w:tc>
           <w:tcPr>
-            <w:tcW w:type="dxa" w:w="2236"/>
+            <w:tcW w:type="dxa" w:w="2222"/>
             <w:tcBorders>
               <w:start w:sz="5.599999999999909" w:val="single" w:color="#E7E4DB"/>
               <w:top w:sz="5.599999999999909" w:val="single" w:color="#E7E4DB"/>
-              <w:end w:sz="6.400000000000091" w:val="single" w:color="#E7E4DB"/>
+              <w:end w:sz="5.599999999999909" w:val="single" w:color="#E7E4DB"/>
               <w:bottom w:sz="5.599999999999909" w:val="single" w:color="#E7E4DB"/>
             </w:tcBorders>
             <w:shd w:fill="f5f2ec"/>
@@ -3568,7 +3578,7 @@
               <w:autoSpaceDE w:val="0"/>
               <w:widowControl/>
               <w:spacing w:line="262" w:lineRule="auto" w:before="106" w:after="0"/>
-              <w:ind w:left="148" w:right="720" w:firstLine="0"/>
+              <w:ind w:left="156" w:right="720" w:firstLine="0"/>
               <w:jc w:val="left"/>
             </w:pPr>
             <w:r>
@@ -3597,9 +3607,9 @@
         </w:tc>
         <w:tc>
           <w:tcPr>
-            <w:tcW w:type="dxa" w:w="2610"/>
+            <w:tcW w:type="dxa" w:w="2520"/>
             <w:tcBorders>
-              <w:start w:sz="6.400000000000091" w:val="single" w:color="#E7E4DB"/>
+              <w:start w:sz="5.599999999999909" w:val="single" w:color="#E7E4DB"/>
               <w:top w:sz="5.599999999999909" w:val="single" w:color="#E7E4DB"/>
               <w:end w:sz="5.599999999999909" w:val="single" w:color="#E7E4DB"/>
               <w:bottom w:sz="5.599999999999909" w:val="single" w:color="#E7E4DB"/>
@@ -3616,7 +3626,7 @@
               <w:autoSpaceDE w:val="0"/>
               <w:widowControl/>
               <w:spacing w:line="262" w:lineRule="auto" w:before="106" w:after="0"/>
-              <w:ind w:left="154" w:right="1152" w:firstLine="0"/>
+              <w:ind w:left="150" w:right="1008" w:firstLine="0"/>
               <w:jc w:val="left"/>
             </w:pPr>
             <w:r>
@@ -3648,7 +3658,7 @@
         </w:tc>
         <w:tc>
           <w:tcPr>
-            <w:tcW w:type="dxa" w:w="1590"/>
+            <w:tcW w:type="dxa" w:w="1574"/>
             <w:tcBorders>
               <w:start w:sz="5.599999999999909" w:val="single" w:color="#E7E4DB"/>
               <w:top w:sz="5.599999999999909" w:val="single" w:color="#E7E4DB"/>
@@ -3667,7 +3677,7 @@
               <w:autoSpaceDE w:val="0"/>
               <w:widowControl/>
               <w:spacing w:line="262" w:lineRule="auto" w:before="106" w:after="0"/>
-              <w:ind w:left="142" w:right="144" w:firstLine="0"/>
+              <w:ind w:left="152" w:right="144" w:firstLine="0"/>
               <w:jc w:val="left"/>
             </w:pPr>
             <w:r>
@@ -3700,283 +3710,7 @@
       </w:tr>
       <w:tr>
         <w:trPr>
-          <w:trHeight w:hRule="exact" w:val="1500"/>
-        </w:trPr>
-        <w:tc>
-          <w:tcPr>
-            <w:tcW w:type="dxa" w:w="1756"/>
-            <w:tcBorders>
-              <w:start w:sz="6.399999999999977" w:val="single" w:color="#E7E4DB"/>
-              <w:top w:sz="5.599999999999909" w:val="single" w:color="#E7E4DB"/>
-              <w:end w:sz="5.599999999999909" w:val="single" w:color="#E7E4DB"/>
-              <w:bottom w:sz="5.599999999999909" w:val="single" w:color="#E7E4DB"/>
-            </w:tcBorders>
-            <w:tcMar>
-              <w:start w:w="0" w:type="dxa"/>
-              <w:end w:w="0" w:type="dxa"/>
-            </w:tcMar>
-          </w:tcPr>
-          <w:p>
-            <w:pPr>
-              <w:autoSpaceDN w:val="0"/>
-              <w:autoSpaceDE w:val="0"/>
-              <w:widowControl/>
-              <w:spacing w:line="240" w:lineRule="auto" w:before="108" w:after="0"/>
-              <w:ind w:left="148" w:right="0" w:firstLine="0"/>
-              <w:jc w:val="left"/>
-            </w:pPr>
-            <w:r>
-              <w:rPr>
-                <w:w w:val="98.08695419974948"/>
-                <w:rFonts w:ascii="Anthropic Sans Print" w:hAnsi="Anthropic Sans Print" w:eastAsia="Anthropic Sans Print"/>
-                <w:b w:val="0"/>
-                <w:i w:val="0"/>
-                <w:color w:val="1F1E1D"/>
-                <w:sz w:val="23"/>
-              </w:rPr>
-              <w:t>Numerador</w:t>
-            </w:r>
-          </w:p>
-        </w:tc>
-        <w:tc>
-          <w:tcPr>
-            <w:tcW w:type="dxa" w:w="1872"/>
-            <w:tcBorders>
-              <w:start w:sz="5.599999999999909" w:val="single" w:color="#E7E4DB"/>
-              <w:top w:sz="5.599999999999909" w:val="single" w:color="#E7E4DB"/>
-              <w:end w:sz="5.599999999999909" w:val="single" w:color="#E7E4DB"/>
-              <w:bottom w:sz="5.599999999999909" w:val="single" w:color="#E7E4DB"/>
-            </w:tcBorders>
-            <w:tcMar>
-              <w:start w:w="0" w:type="dxa"/>
-              <w:end w:w="0" w:type="dxa"/>
-            </w:tcMar>
-          </w:tcPr>
-          <w:p>
-            <w:pPr>
-              <w:autoSpaceDN w:val="0"/>
-              <w:autoSpaceDE w:val="0"/>
-              <w:widowControl/>
-              <w:spacing w:line="262" w:lineRule="auto" w:before="108" w:after="0"/>
-              <w:ind w:left="144" w:right="720" w:firstLine="0"/>
-              <w:jc w:val="center"/>
-            </w:pPr>
-            <w:r>
-              <w:rPr>
-                <w:w w:val="98.08695419974948"/>
-                <w:rFonts w:ascii="Anthropic Sans Print" w:hAnsi="Anthropic Sans Print" w:eastAsia="Anthropic Sans Print"/>
-                <w:b w:val="0"/>
-                <w:i w:val="0"/>
-                <w:color w:val="1F1E1D"/>
-                <w:sz w:val="23"/>
-              </w:rPr>
-              <w:t xml:space="preserve">8 (2 por </w:t>
-            </w:r>
-            <w:r>
-              <w:br/>
-            </w:r>
-            <w:r>
-              <w:rPr>
-                <w:w w:val="98.08695419974948"/>
-                <w:rFonts w:ascii="Anthropic Sans Print" w:hAnsi="Anthropic Sans Print" w:eastAsia="Anthropic Sans Print"/>
-                <w:b w:val="0"/>
-                <w:i w:val="0"/>
-                <w:color w:val="1F1E1D"/>
-                <w:sz w:val="23"/>
-              </w:rPr>
-              <w:t>tablero)</w:t>
-            </w:r>
-          </w:p>
-        </w:tc>
-        <w:tc>
-          <w:tcPr>
-            <w:tcW w:type="dxa" w:w="2236"/>
-            <w:tcBorders>
-              <w:start w:sz="5.599999999999909" w:val="single" w:color="#E7E4DB"/>
-              <w:top w:sz="5.599999999999909" w:val="single" w:color="#E7E4DB"/>
-              <w:end w:sz="6.400000000000091" w:val="single" w:color="#E7E4DB"/>
-              <w:bottom w:sz="5.599999999999909" w:val="single" w:color="#E7E4DB"/>
-            </w:tcBorders>
-            <w:tcMar>
-              <w:start w:w="0" w:type="dxa"/>
-              <w:end w:w="0" w:type="dxa"/>
-            </w:tcMar>
-          </w:tcPr>
-          <w:p>
-            <w:pPr>
-              <w:autoSpaceDN w:val="0"/>
-              <w:autoSpaceDE w:val="0"/>
-              <w:widowControl/>
-              <w:spacing w:line="240" w:lineRule="auto" w:before="108" w:after="0"/>
-              <w:ind w:left="148" w:right="0" w:firstLine="0"/>
-              <w:jc w:val="left"/>
-            </w:pPr>
-            <w:r>
-              <w:rPr>
-                <w:w w:val="98.08695419974948"/>
-                <w:rFonts w:ascii="Anthropic Sans Print" w:hAnsi="Anthropic Sans Print" w:eastAsia="Anthropic Sans Print"/>
-                <w:b w:val="0"/>
-                <w:i w:val="0"/>
-                <w:color w:val="1F1E1D"/>
-                <w:sz w:val="23"/>
-              </w:rPr>
-              <w:t>BA15d</w:t>
-            </w:r>
-          </w:p>
-        </w:tc>
-        <w:tc>
-          <w:tcPr>
-            <w:tcW w:type="dxa" w:w="2610"/>
-            <w:tcBorders>
-              <w:start w:sz="6.400000000000091" w:val="single" w:color="#E7E4DB"/>
-              <w:top w:sz="5.599999999999909" w:val="single" w:color="#E7E4DB"/>
-              <w:end w:sz="5.599999999999909" w:val="single" w:color="#E7E4DB"/>
-              <w:bottom w:sz="5.599999999999909" w:val="single" w:color="#E7E4DB"/>
-            </w:tcBorders>
-            <w:tcMar>
-              <w:start w:w="0" w:type="dxa"/>
-              <w:end w:w="0" w:type="dxa"/>
-            </w:tcMar>
-          </w:tcPr>
-          <w:p>
-            <w:pPr>
-              <w:autoSpaceDN w:val="0"/>
-              <w:autoSpaceDE w:val="0"/>
-              <w:widowControl/>
-              <w:spacing w:line="266" w:lineRule="auto" w:before="108" w:after="0"/>
-              <w:ind w:left="154" w:right="144" w:firstLine="0"/>
-              <w:jc w:val="left"/>
-            </w:pPr>
-            <w:r>
-              <w:rPr>
-                <w:w w:val="98.08695419974948"/>
-                <w:rFonts w:ascii="Anthropic Sans Print" w:hAnsi="Anthropic Sans Print" w:eastAsia="Anthropic Sans Print"/>
-                <w:b w:val="0"/>
-                <w:i w:val="0"/>
-                <w:color w:val="1F1E1D"/>
-                <w:sz w:val="23"/>
-              </w:rPr>
-              <w:t xml:space="preserve">LED blanca de 75 </w:t>
-            </w:r>
-            <w:r>
-              <w:br/>
-            </w:r>
-            <w:r>
-              <w:rPr>
-                <w:w w:val="98.08695419974948"/>
-                <w:rFonts w:ascii="Anthropic Sans Print" w:hAnsi="Anthropic Sans Print" w:eastAsia="Anthropic Sans Print"/>
-                <w:b w:val="0"/>
-                <w:i w:val="0"/>
-                <w:color w:val="1F1E1D"/>
-                <w:sz w:val="23"/>
-              </w:rPr>
-              <w:t xml:space="preserve">Vcc, 570 lm, IP67, −40 </w:t>
-            </w:r>
-            <w:r>
-              <w:rPr>
-                <w:w w:val="98.08695419974948"/>
-                <w:rFonts w:ascii="Anthropic Sans Print" w:hAnsi="Anthropic Sans Print" w:eastAsia="Anthropic Sans Print"/>
-                <w:b w:val="0"/>
-                <w:i w:val="0"/>
-                <w:color w:val="1F1E1D"/>
-                <w:sz w:val="23"/>
-              </w:rPr>
-              <w:t>a +70 °C (</w:t>
-            </w:r>
-            <w:r>
-              <w:rPr>
-                <w:u w:val="single" w:color="2978d5"/>
-                <w:w w:val="98.08695419974948"/>
-                <w:rFonts w:ascii="Anthropic Sans Print" w:hAnsi="Anthropic Sans Print" w:eastAsia="Anthropic Sans Print"/>
-                <w:b w:val="0"/>
-                <w:i w:val="0"/>
-                <w:color w:val="2A78D6"/>
-                <w:sz w:val="23"/>
-              </w:rPr>
-              <w:hyperlink r:id="rId13" w:history="1">
-                <w:r>
-                  <w:rPr>
-                    <w:rStyle w:val="Hyperlink"/>
-                  </w:rPr>
-                  <w:t xml:space="preserve">Railhead, </w:t>
-                </w:r>
-              </w:hyperlink>
-            </w:r>
-            <w:r>
-              <w:br/>
-            </w:r>
-            <w:r>
-              <w:rPr>
-                <w:u w:val="single" w:color="2978d5"/>
-                <w:w w:val="98.08695419974948"/>
-                <w:rFonts w:ascii="Anthropic Sans Print" w:hAnsi="Anthropic Sans Print" w:eastAsia="Anthropic Sans Print"/>
-                <w:b w:val="0"/>
-                <w:i w:val="0"/>
-                <w:color w:val="2A78D6"/>
-                <w:sz w:val="23"/>
-              </w:rPr>
-              <w:hyperlink r:id="rId13" w:history="1">
-                <w:r>
-                  <w:rPr>
-                    <w:rStyle w:val="Hyperlink"/>
-                  </w:rPr>
-                  <w:t>lámpara universal</w:t>
-                </w:r>
-              </w:hyperlink>
-            </w:r>
-            <w:r>
-              <w:rPr>
-                <w:w w:val="98.08695419974948"/>
-                <w:rFonts w:ascii="Anthropic Sans Print" w:hAnsi="Anthropic Sans Print" w:eastAsia="Anthropic Sans Print"/>
-                <w:b w:val="0"/>
-                <w:i w:val="0"/>
-                <w:color w:val="1F1E1D"/>
-                <w:sz w:val="23"/>
-              </w:rPr>
-              <w:t>)</w:t>
-            </w:r>
-          </w:p>
-        </w:tc>
-        <w:tc>
-          <w:tcPr>
-            <w:tcW w:type="dxa" w:w="1590"/>
-            <w:tcBorders>
-              <w:start w:sz="5.599999999999909" w:val="single" w:color="#E7E4DB"/>
-              <w:top w:sz="5.599999999999909" w:val="single" w:color="#E7E4DB"/>
-              <w:end w:sz="6.399999999999636" w:val="single" w:color="#E7E4DB"/>
-              <w:bottom w:sz="5.599999999999909" w:val="single" w:color="#E7E4DB"/>
-            </w:tcBorders>
-            <w:tcMar>
-              <w:start w:w="0" w:type="dxa"/>
-              <w:end w:w="0" w:type="dxa"/>
-            </w:tcMar>
-          </w:tcPr>
-          <w:p>
-            <w:pPr>
-              <w:autoSpaceDN w:val="0"/>
-              <w:autoSpaceDE w:val="0"/>
-              <w:widowControl/>
-              <w:spacing w:line="240" w:lineRule="auto" w:before="108" w:after="0"/>
-              <w:ind w:left="142" w:right="0" w:firstLine="0"/>
-              <w:jc w:val="left"/>
-            </w:pPr>
-            <w:r>
-              <w:rPr>
-                <w:w w:val="98.08695419974948"/>
-                <w:rFonts w:ascii="Anthropic Sans Print" w:hAnsi="Anthropic Sans Print" w:eastAsia="Anthropic Sans Print"/>
-                <w:b w:val="0"/>
-                <w:i w:val="0"/>
-                <w:color w:val="1F1E1D"/>
-                <w:sz w:val="23"/>
-              </w:rPr>
-              <w:t>6 W</w:t>
-            </w:r>
-          </w:p>
-        </w:tc>
-      </w:tr>
-      <w:tr>
-        <w:trPr>
-          <w:trHeight w:hRule="exact" w:val="856"/>
+          <w:trHeight w:hRule="exact" w:val="1832"/>
         </w:trPr>
         <w:tc>
           <w:tcPr>
@@ -4010,13 +3744,60 @@
                 <w:color w:val="1F1E1D"/>
                 <w:sz w:val="23"/>
               </w:rPr>
-              <w:t>Estribo</w:t>
+              <w:t>Numerador</w:t>
             </w:r>
           </w:p>
         </w:tc>
         <w:tc>
           <w:tcPr>
-            <w:tcW w:type="dxa" w:w="1872"/>
+            <w:tcW w:type="dxa" w:w="1992"/>
+            <w:tcBorders>
+              <w:start w:sz="5.599999999999909" w:val="single" w:color="#E7E4DB"/>
+              <w:top w:sz="5.599999999999909" w:val="single" w:color="#E7E4DB"/>
+              <w:end w:sz="5.599999999999909" w:val="single" w:color="#E7E4DB"/>
+              <w:bottom w:sz="6.400000000000091" w:val="single" w:color="#E7E4DB"/>
+            </w:tcBorders>
+            <w:tcMar>
+              <w:start w:w="0" w:type="dxa"/>
+              <w:end w:w="0" w:type="dxa"/>
+            </w:tcMar>
+          </w:tcPr>
+          <w:p>
+            <w:pPr>
+              <w:autoSpaceDN w:val="0"/>
+              <w:autoSpaceDE w:val="0"/>
+              <w:widowControl/>
+              <w:spacing w:line="262" w:lineRule="auto" w:before="108" w:after="0"/>
+              <w:ind w:left="142" w:right="144" w:firstLine="0"/>
+              <w:jc w:val="left"/>
+            </w:pPr>
+            <w:r>
+              <w:rPr>
+                <w:w w:val="98.08695419974948"/>
+                <w:rFonts w:ascii="Anthropic Sans Print" w:hAnsi="Anthropic Sans Print" w:eastAsia="Anthropic Sans Print"/>
+                <w:b w:val="0"/>
+                <w:i w:val="0"/>
+                <w:color w:val="1F1E1D"/>
+                <w:sz w:val="23"/>
+              </w:rPr>
+              <w:t xml:space="preserve">8 (2 por tablero, </w:t>
+            </w:r>
+            <w:r>
+              <w:rPr>
+                <w:w w:val="98.08695419974948"/>
+                <w:rFonts w:ascii="Anthropic Sans Print" w:hAnsi="Anthropic Sans Print" w:eastAsia="Anthropic Sans Print"/>
+                <w:b w:val="0"/>
+                <w:i w:val="0"/>
+                <w:color w:val="1F1E1D"/>
+                <w:sz w:val="23"/>
+              </w:rPr>
+              <w:t>confirmado)</w:t>
+            </w:r>
+          </w:p>
+        </w:tc>
+        <w:tc>
+          <w:tcPr>
+            <w:tcW w:type="dxa" w:w="2222"/>
             <w:tcBorders>
               <w:start w:sz="5.599999999999909" w:val="single" w:color="#E7E4DB"/>
               <w:top w:sz="5.599999999999909" w:val="single" w:color="#E7E4DB"/>
@@ -4034,7 +3815,241 @@
               <w:autoSpaceDE w:val="0"/>
               <w:widowControl/>
               <w:spacing w:line="240" w:lineRule="auto" w:before="108" w:after="0"/>
-              <w:ind w:left="144" w:right="0" w:firstLine="0"/>
+              <w:ind w:left="156" w:right="0" w:firstLine="0"/>
+              <w:jc w:val="left"/>
+            </w:pPr>
+            <w:r>
+              <w:rPr>
+                <w:w w:val="98.08695419974948"/>
+                <w:rFonts w:ascii="Anthropic Sans Print" w:hAnsi="Anthropic Sans Print" w:eastAsia="Anthropic Sans Print"/>
+                <w:b w:val="0"/>
+                <w:i w:val="0"/>
+                <w:color w:val="1F1E1D"/>
+                <w:sz w:val="23"/>
+              </w:rPr>
+              <w:t>BA15d</w:t>
+            </w:r>
+          </w:p>
+        </w:tc>
+        <w:tc>
+          <w:tcPr>
+            <w:tcW w:type="dxa" w:w="2520"/>
+            <w:tcBorders>
+              <w:start w:sz="5.599999999999909" w:val="single" w:color="#E7E4DB"/>
+              <w:top w:sz="5.599999999999909" w:val="single" w:color="#E7E4DB"/>
+              <w:end w:sz="5.599999999999909" w:val="single" w:color="#E7E4DB"/>
+              <w:bottom w:sz="6.400000000000091" w:val="single" w:color="#E7E4DB"/>
+            </w:tcBorders>
+            <w:tcMar>
+              <w:start w:w="0" w:type="dxa"/>
+              <w:end w:w="0" w:type="dxa"/>
+            </w:tcMar>
+          </w:tcPr>
+          <w:p>
+            <w:pPr>
+              <w:autoSpaceDN w:val="0"/>
+              <w:autoSpaceDE w:val="0"/>
+              <w:widowControl/>
+              <w:spacing w:line="269" w:lineRule="auto" w:before="108" w:after="0"/>
+              <w:ind w:left="150" w:right="288" w:firstLine="0"/>
+              <w:jc w:val="left"/>
+            </w:pPr>
+            <w:r>
+              <w:rPr>
+                <w:w w:val="98.08695419974948"/>
+                <w:rFonts w:ascii="Anthropic Sans Print" w:hAnsi="Anthropic Sans Print" w:eastAsia="Anthropic Sans Print"/>
+                <w:b w:val="0"/>
+                <w:i w:val="0"/>
+                <w:color w:val="1F1E1D"/>
+                <w:sz w:val="23"/>
+              </w:rPr>
+              <w:t xml:space="preserve">LED blanca de 75 </w:t>
+            </w:r>
+            <w:r>
+              <w:rPr>
+                <w:w w:val="98.08695419974948"/>
+                <w:rFonts w:ascii="Anthropic Sans Print" w:hAnsi="Anthropic Sans Print" w:eastAsia="Anthropic Sans Print"/>
+                <w:b w:val="0"/>
+                <w:i w:val="0"/>
+                <w:color w:val="1F1E1D"/>
+                <w:sz w:val="23"/>
+              </w:rPr>
+              <w:t>Vcc, 570 lm, IP67,</w:t>
+            </w:r>
+            <w:r>
+              <w:rPr>
+                <w:w w:val="98.08695419974948"/>
+                <w:rFonts w:ascii="Anthropic Sans Print" w:hAnsi="Anthropic Sans Print" w:eastAsia="Anthropic Sans Print"/>
+                <w:b w:val="0"/>
+                <w:i w:val="0"/>
+                <w:color w:val="1F1E1D"/>
+                <w:sz w:val="23"/>
+              </w:rPr>
+              <w:t xml:space="preserve">−40 a +70 °C </w:t>
+            </w:r>
+            <w:r>
+              <w:br/>
+            </w:r>
+            <w:r>
+              <w:rPr>
+                <w:w w:val="98.08695419974948"/>
+                <w:rFonts w:ascii="Anthropic Sans Print" w:hAnsi="Anthropic Sans Print" w:eastAsia="Anthropic Sans Print"/>
+                <w:b w:val="0"/>
+                <w:i w:val="0"/>
+                <w:color w:val="1F1E1D"/>
+                <w:sz w:val="23"/>
+              </w:rPr>
+              <w:t>(</w:t>
+            </w:r>
+            <w:r>
+              <w:rPr>
+                <w:u w:val="single" w:color="2978d5"/>
+                <w:w w:val="98.08695419974948"/>
+                <w:rFonts w:ascii="Anthropic Sans Print" w:hAnsi="Anthropic Sans Print" w:eastAsia="Anthropic Sans Print"/>
+                <w:b w:val="0"/>
+                <w:i w:val="0"/>
+                <w:color w:val="2A78D6"/>
+                <w:sz w:val="23"/>
+              </w:rPr>
+              <w:hyperlink r:id="rId13" w:history="1">
+                <w:r>
+                  <w:rPr>
+                    <w:rStyle w:val="Hyperlink"/>
+                  </w:rPr>
+                  <w:t xml:space="preserve">Railhead, lámpara </w:t>
+                </w:r>
+              </w:hyperlink>
+            </w:r>
+            <w:r>
+              <w:rPr>
+                <w:u w:val="single" w:color="2978d5"/>
+                <w:w w:val="98.08695419974948"/>
+                <w:rFonts w:ascii="Anthropic Sans Print" w:hAnsi="Anthropic Sans Print" w:eastAsia="Anthropic Sans Print"/>
+                <w:b w:val="0"/>
+                <w:i w:val="0"/>
+                <w:color w:val="2A78D6"/>
+                <w:sz w:val="23"/>
+              </w:rPr>
+              <w:hyperlink r:id="rId13" w:history="1">
+                <w:r>
+                  <w:rPr>
+                    <w:rStyle w:val="Hyperlink"/>
+                  </w:rPr>
+                  <w:t>universal</w:t>
+                </w:r>
+              </w:hyperlink>
+            </w:r>
+            <w:r>
+              <w:rPr>
+                <w:w w:val="98.08695419974948"/>
+                <w:rFonts w:ascii="Anthropic Sans Print" w:hAnsi="Anthropic Sans Print" w:eastAsia="Anthropic Sans Print"/>
+                <w:b w:val="0"/>
+                <w:i w:val="0"/>
+                <w:color w:val="1F1E1D"/>
+                <w:sz w:val="23"/>
+              </w:rPr>
+              <w:t>)</w:t>
+            </w:r>
+          </w:p>
+        </w:tc>
+        <w:tc>
+          <w:tcPr>
+            <w:tcW w:type="dxa" w:w="1574"/>
+            <w:tcBorders>
+              <w:start w:sz="5.599999999999909" w:val="single" w:color="#E7E4DB"/>
+              <w:top w:sz="5.599999999999909" w:val="single" w:color="#E7E4DB"/>
+              <w:end w:sz="6.399999999999636" w:val="single" w:color="#E7E4DB"/>
+              <w:bottom w:sz="6.400000000000091" w:val="single" w:color="#E7E4DB"/>
+            </w:tcBorders>
+            <w:tcMar>
+              <w:start w:w="0" w:type="dxa"/>
+              <w:end w:w="0" w:type="dxa"/>
+            </w:tcMar>
+          </w:tcPr>
+          <w:p>
+            <w:pPr>
+              <w:autoSpaceDN w:val="0"/>
+              <w:autoSpaceDE w:val="0"/>
+              <w:widowControl/>
+              <w:spacing w:line="240" w:lineRule="auto" w:before="108" w:after="0"/>
+              <w:ind w:left="152" w:right="0" w:firstLine="0"/>
+              <w:jc w:val="left"/>
+            </w:pPr>
+            <w:r>
+              <w:rPr>
+                <w:w w:val="98.08695419974948"/>
+                <w:rFonts w:ascii="Anthropic Sans Print" w:hAnsi="Anthropic Sans Print" w:eastAsia="Anthropic Sans Print"/>
+                <w:b w:val="0"/>
+                <w:i w:val="0"/>
+                <w:color w:val="1F1E1D"/>
+                <w:sz w:val="23"/>
+              </w:rPr>
+              <w:t>6 W</w:t>
+            </w:r>
+          </w:p>
+        </w:tc>
+      </w:tr>
+      <w:tr>
+        <w:trPr>
+          <w:trHeight w:hRule="exact" w:val="854"/>
+        </w:trPr>
+        <w:tc>
+          <w:tcPr>
+            <w:tcW w:type="dxa" w:w="1756"/>
+            <w:tcBorders>
+              <w:start w:sz="6.399999999999977" w:val="single" w:color="#E7E4DB"/>
+              <w:top w:sz="6.400000000000091" w:val="single" w:color="#E7E4DB"/>
+              <w:end w:sz="5.599999999999909" w:val="single" w:color="#E7E4DB"/>
+              <w:bottom w:sz="5.599999999999909" w:val="single" w:color="#E7E4DB"/>
+            </w:tcBorders>
+            <w:tcMar>
+              <w:start w:w="0" w:type="dxa"/>
+              <w:end w:w="0" w:type="dxa"/>
+            </w:tcMar>
+          </w:tcPr>
+          <w:p>
+            <w:pPr>
+              <w:autoSpaceDN w:val="0"/>
+              <w:autoSpaceDE w:val="0"/>
+              <w:widowControl/>
+              <w:spacing w:line="240" w:lineRule="auto" w:before="106" w:after="0"/>
+              <w:ind w:left="148" w:right="0" w:firstLine="0"/>
+              <w:jc w:val="left"/>
+            </w:pPr>
+            <w:r>
+              <w:rPr>
+                <w:w w:val="98.08695419974948"/>
+                <w:rFonts w:ascii="Anthropic Sans Print" w:hAnsi="Anthropic Sans Print" w:eastAsia="Anthropic Sans Print"/>
+                <w:b w:val="0"/>
+                <w:i w:val="0"/>
+                <w:color w:val="1F1E1D"/>
+                <w:sz w:val="23"/>
+              </w:rPr>
+              <w:t>Estribo</w:t>
+            </w:r>
+          </w:p>
+        </w:tc>
+        <w:tc>
+          <w:tcPr>
+            <w:tcW w:type="dxa" w:w="1992"/>
+            <w:tcBorders>
+              <w:start w:sz="5.599999999999909" w:val="single" w:color="#E7E4DB"/>
+              <w:top w:sz="6.400000000000091" w:val="single" w:color="#E7E4DB"/>
+              <w:end w:sz="5.599999999999909" w:val="single" w:color="#E7E4DB"/>
+              <w:bottom w:sz="5.599999999999909" w:val="single" w:color="#E7E4DB"/>
+            </w:tcBorders>
+            <w:tcMar>
+              <w:start w:w="0" w:type="dxa"/>
+              <w:end w:w="0" w:type="dxa"/>
+            </w:tcMar>
+          </w:tcPr>
+          <w:p>
+            <w:pPr>
+              <w:autoSpaceDN w:val="0"/>
+              <w:autoSpaceDE w:val="0"/>
+              <w:widowControl/>
+              <w:spacing w:line="240" w:lineRule="auto" w:before="106" w:after="0"/>
+              <w:ind w:left="142" w:right="0" w:firstLine="0"/>
               <w:jc w:val="left"/>
             </w:pPr>
             <w:r>
@@ -4052,12 +4067,12 @@
         </w:tc>
         <w:tc>
           <w:tcPr>
-            <w:tcW w:type="dxa" w:w="2236"/>
+            <w:tcW w:type="dxa" w:w="2222"/>
             <w:tcBorders>
               <w:start w:sz="5.599999999999909" w:val="single" w:color="#E7E4DB"/>
-              <w:top w:sz="5.599999999999909" w:val="single" w:color="#E7E4DB"/>
-              <w:end w:sz="6.400000000000091" w:val="single" w:color="#E7E4DB"/>
-              <w:bottom w:sz="6.400000000000091" w:val="single" w:color="#E7E4DB"/>
+              <w:top w:sz="6.400000000000091" w:val="single" w:color="#E7E4DB"/>
+              <w:end w:sz="5.599999999999909" w:val="single" w:color="#E7E4DB"/>
+              <w:bottom w:sz="5.599999999999909" w:val="single" w:color="#E7E4DB"/>
             </w:tcBorders>
             <w:tcMar>
               <w:start w:w="0" w:type="dxa"/>
@@ -4069,8 +4084,8 @@
               <w:autoSpaceDN w:val="0"/>
               <w:autoSpaceDE w:val="0"/>
               <w:widowControl/>
-              <w:spacing w:line="240" w:lineRule="auto" w:before="108" w:after="0"/>
-              <w:ind w:left="148" w:right="0" w:firstLine="0"/>
+              <w:spacing w:line="240" w:lineRule="auto" w:before="106" w:after="0"/>
+              <w:ind w:left="156" w:right="0" w:firstLine="0"/>
               <w:jc w:val="left"/>
             </w:pPr>
             <w:r>
@@ -4088,12 +4103,12 @@
         </w:tc>
         <w:tc>
           <w:tcPr>
-            <w:tcW w:type="dxa" w:w="2610"/>
+            <w:tcW w:type="dxa" w:w="2520"/>
             <w:tcBorders>
-              <w:start w:sz="6.400000000000091" w:val="single" w:color="#E7E4DB"/>
-              <w:top w:sz="5.599999999999909" w:val="single" w:color="#E7E4DB"/>
+              <w:start w:sz="5.599999999999909" w:val="single" w:color="#E7E4DB"/>
+              <w:top w:sz="6.400000000000091" w:val="single" w:color="#E7E4DB"/>
               <w:end w:sz="5.599999999999909" w:val="single" w:color="#E7E4DB"/>
-              <w:bottom w:sz="6.400000000000091" w:val="single" w:color="#E7E4DB"/>
+              <w:bottom w:sz="5.599999999999909" w:val="single" w:color="#E7E4DB"/>
             </w:tcBorders>
             <w:tcMar>
               <w:start w:w="0" w:type="dxa"/>
@@ -4105,8 +4120,8 @@
               <w:autoSpaceDN w:val="0"/>
               <w:autoSpaceDE w:val="0"/>
               <w:widowControl/>
-              <w:spacing w:line="262" w:lineRule="auto" w:before="108" w:after="0"/>
-              <w:ind w:left="154" w:right="432" w:firstLine="0"/>
+              <w:spacing w:line="262" w:lineRule="auto" w:before="106" w:after="0"/>
+              <w:ind w:left="150" w:right="288" w:firstLine="0"/>
               <w:jc w:val="left"/>
             </w:pPr>
             <w:r>
@@ -4135,12 +4150,12 @@
         </w:tc>
         <w:tc>
           <w:tcPr>
-            <w:tcW w:type="dxa" w:w="1590"/>
+            <w:tcW w:type="dxa" w:w="1574"/>
             <w:tcBorders>
               <w:start w:sz="5.599999999999909" w:val="single" w:color="#E7E4DB"/>
-              <w:top w:sz="5.599999999999909" w:val="single" w:color="#E7E4DB"/>
+              <w:top w:sz="6.400000000000091" w:val="single" w:color="#E7E4DB"/>
               <w:end w:sz="6.399999999999636" w:val="single" w:color="#E7E4DB"/>
-              <w:bottom w:sz="6.400000000000091" w:val="single" w:color="#E7E4DB"/>
+              <w:bottom w:sz="5.599999999999909" w:val="single" w:color="#E7E4DB"/>
             </w:tcBorders>
             <w:tcMar>
               <w:start w:w="0" w:type="dxa"/>
@@ -4152,8 +4167,8 @@
               <w:autoSpaceDN w:val="0"/>
               <w:autoSpaceDE w:val="0"/>
               <w:widowControl/>
-              <w:spacing w:line="240" w:lineRule="auto" w:before="108" w:after="0"/>
-              <w:ind w:left="142" w:right="0" w:firstLine="0"/>
+              <w:spacing w:line="240" w:lineRule="auto" w:before="106" w:after="0"/>
+              <w:ind w:left="152" w:right="0" w:firstLine="0"/>
               <w:jc w:val="left"/>
             </w:pPr>
             <w:r>
@@ -4179,9 +4194,9 @@
             <w:tcW w:type="dxa" w:w="1756"/>
             <w:tcBorders>
               <w:start w:sz="6.399999999999977" w:val="single" w:color="#E7E4DB"/>
-              <w:top w:sz="6.400000000000091" w:val="single" w:color="#E7E4DB"/>
+              <w:top w:sz="5.599999999999909" w:val="single" w:color="#E7E4DB"/>
               <w:end w:sz="5.599999999999909" w:val="single" w:color="#E7E4DB"/>
-              <w:bottom w:sz="6.400000000000091" w:val="single" w:color="#E7E4DB"/>
+              <w:bottom w:sz="5.599999999999909" w:val="single" w:color="#E7E4DB"/>
             </w:tcBorders>
             <w:tcMar>
               <w:start w:w="0" w:type="dxa"/>
@@ -4212,12 +4227,12 @@
         </w:tc>
         <w:tc>
           <w:tcPr>
-            <w:tcW w:type="dxa" w:w="1872"/>
+            <w:tcW w:type="dxa" w:w="1992"/>
             <w:tcBorders>
               <w:start w:sz="5.599999999999909" w:val="single" w:color="#E7E4DB"/>
-              <w:top w:sz="6.400000000000091" w:val="single" w:color="#E7E4DB"/>
+              <w:top w:sz="5.599999999999909" w:val="single" w:color="#E7E4DB"/>
               <w:end w:sz="5.599999999999909" w:val="single" w:color="#E7E4DB"/>
-              <w:bottom w:sz="6.400000000000091" w:val="single" w:color="#E7E4DB"/>
+              <w:bottom w:sz="5.599999999999909" w:val="single" w:color="#E7E4DB"/>
             </w:tcBorders>
             <w:tcMar>
               <w:start w:w="0" w:type="dxa"/>
@@ -4230,7 +4245,7 @@
               <w:autoSpaceDE w:val="0"/>
               <w:widowControl/>
               <w:spacing w:line="240" w:lineRule="auto" w:before="106" w:after="0"/>
-              <w:ind w:left="144" w:right="0" w:firstLine="0"/>
+              <w:ind w:left="142" w:right="0" w:firstLine="0"/>
               <w:jc w:val="left"/>
             </w:pPr>
             <w:r>
@@ -4248,12 +4263,12 @@
         </w:tc>
         <w:tc>
           <w:tcPr>
-            <w:tcW w:type="dxa" w:w="2236"/>
+            <w:tcW w:type="dxa" w:w="2222"/>
             <w:tcBorders>
               <w:start w:sz="5.599999999999909" w:val="single" w:color="#E7E4DB"/>
-              <w:top w:sz="6.400000000000091" w:val="single" w:color="#E7E4DB"/>
-              <w:end w:sz="6.400000000000091" w:val="single" w:color="#E7E4DB"/>
-              <w:bottom w:sz="6.400000000000091" w:val="single" w:color="#E7E4DB"/>
+              <w:top w:sz="5.599999999999909" w:val="single" w:color="#E7E4DB"/>
+              <w:end w:sz="5.599999999999909" w:val="single" w:color="#E7E4DB"/>
+              <w:bottom w:sz="5.599999999999909" w:val="single" w:color="#E7E4DB"/>
             </w:tcBorders>
             <w:tcMar>
               <w:start w:w="0" w:type="dxa"/>
@@ -4265,8 +4280,8 @@
               <w:autoSpaceDN w:val="0"/>
               <w:autoSpaceDE w:val="0"/>
               <w:widowControl/>
-              <w:spacing w:line="262" w:lineRule="auto" w:before="106" w:after="0"/>
-              <w:ind w:left="148" w:right="432" w:firstLine="0"/>
+              <w:spacing w:line="254" w:lineRule="auto" w:before="106" w:after="0"/>
+              <w:ind w:left="156" w:right="432" w:firstLine="0"/>
               <w:jc w:val="left"/>
             </w:pPr>
             <w:r>
@@ -4295,12 +4310,12 @@
         </w:tc>
         <w:tc>
           <w:tcPr>
-            <w:tcW w:type="dxa" w:w="2610"/>
+            <w:tcW w:type="dxa" w:w="2520"/>
             <w:tcBorders>
-              <w:start w:sz="6.400000000000091" w:val="single" w:color="#E7E4DB"/>
-              <w:top w:sz="6.400000000000091" w:val="single" w:color="#E7E4DB"/>
+              <w:start w:sz="5.599999999999909" w:val="single" w:color="#E7E4DB"/>
+              <w:top w:sz="5.599999999999909" w:val="single" w:color="#E7E4DB"/>
               <w:end w:sz="5.599999999999909" w:val="single" w:color="#E7E4DB"/>
-              <w:bottom w:sz="6.400000000000091" w:val="single" w:color="#E7E4DB"/>
+              <w:bottom w:sz="5.599999999999909" w:val="single" w:color="#E7E4DB"/>
             </w:tcBorders>
             <w:tcMar>
               <w:start w:w="0" w:type="dxa"/>
@@ -4312,8 +4327,8 @@
               <w:autoSpaceDN w:val="0"/>
               <w:autoSpaceDE w:val="0"/>
               <w:widowControl/>
-              <w:spacing w:line="262" w:lineRule="auto" w:before="106" w:after="0"/>
-              <w:ind w:left="154" w:right="432" w:firstLine="0"/>
+              <w:spacing w:line="254" w:lineRule="auto" w:before="106" w:after="0"/>
+              <w:ind w:left="150" w:right="288" w:firstLine="0"/>
               <w:jc w:val="left"/>
             </w:pPr>
             <w:r>
@@ -4342,12 +4357,12 @@
         </w:tc>
         <w:tc>
           <w:tcPr>
-            <w:tcW w:type="dxa" w:w="1590"/>
+            <w:tcW w:type="dxa" w:w="1574"/>
             <w:tcBorders>
               <w:start w:sz="5.599999999999909" w:val="single" w:color="#E7E4DB"/>
-              <w:top w:sz="6.400000000000091" w:val="single" w:color="#E7E4DB"/>
+              <w:top w:sz="5.599999999999909" w:val="single" w:color="#E7E4DB"/>
               <w:end w:sz="6.399999999999636" w:val="single" w:color="#E7E4DB"/>
-              <w:bottom w:sz="6.400000000000091" w:val="single" w:color="#E7E4DB"/>
+              <w:bottom w:sz="5.599999999999909" w:val="single" w:color="#E7E4DB"/>
             </w:tcBorders>
             <w:tcMar>
               <w:start w:w="0" w:type="dxa"/>
@@ -4360,7 +4375,7 @@
               <w:autoSpaceDE w:val="0"/>
               <w:widowControl/>
               <w:spacing w:line="240" w:lineRule="auto" w:before="106" w:after="0"/>
-              <w:ind w:left="142" w:right="0" w:firstLine="0"/>
+              <w:ind w:left="152" w:right="0" w:firstLine="0"/>
               <w:jc w:val="left"/>
             </w:pPr>
             <w:r>
@@ -4386,9 +4401,9 @@
             <w:tcW w:type="dxa" w:w="1756"/>
             <w:tcBorders>
               <w:start w:sz="6.399999999999977" w:val="single" w:color="#E7E4DB"/>
-              <w:top w:sz="6.400000000000091" w:val="single" w:color="#E7E4DB"/>
+              <w:top w:sz="5.599999999999909" w:val="single" w:color="#E7E4DB"/>
               <w:end w:sz="5.599999999999909" w:val="single" w:color="#E7E4DB"/>
-              <w:bottom w:sz="5.599999999999909" w:val="single" w:color="#E7E4DB"/>
+              <w:bottom w:sz="6.400000000000091" w:val="single" w:color="#E7E4DB"/>
             </w:tcBorders>
             <w:tcMar>
               <w:start w:w="0" w:type="dxa"/>
@@ -4433,12 +4448,12 @@
         </w:tc>
         <w:tc>
           <w:tcPr>
-            <w:tcW w:type="dxa" w:w="1872"/>
+            <w:tcW w:type="dxa" w:w="1992"/>
             <w:tcBorders>
               <w:start w:sz="5.599999999999909" w:val="single" w:color="#E7E4DB"/>
-              <w:top w:sz="6.400000000000091" w:val="single" w:color="#E7E4DB"/>
+              <w:top w:sz="5.599999999999909" w:val="single" w:color="#E7E4DB"/>
               <w:end w:sz="5.599999999999909" w:val="single" w:color="#E7E4DB"/>
-              <w:bottom w:sz="5.599999999999909" w:val="single" w:color="#E7E4DB"/>
+              <w:bottom w:sz="6.400000000000091" w:val="single" w:color="#E7E4DB"/>
             </w:tcBorders>
             <w:tcMar>
               <w:start w:w="0" w:type="dxa"/>
@@ -4451,7 +4466,7 @@
               <w:autoSpaceDE w:val="0"/>
               <w:widowControl/>
               <w:spacing w:line="240" w:lineRule="auto" w:before="106" w:after="0"/>
-              <w:ind w:left="144" w:right="0" w:firstLine="0"/>
+              <w:ind w:left="142" w:right="0" w:firstLine="0"/>
               <w:jc w:val="left"/>
             </w:pPr>
             <w:r>
@@ -4469,12 +4484,12 @@
         </w:tc>
         <w:tc>
           <w:tcPr>
-            <w:tcW w:type="dxa" w:w="2236"/>
+            <w:tcW w:type="dxa" w:w="2222"/>
             <w:tcBorders>
               <w:start w:sz="5.599999999999909" w:val="single" w:color="#E7E4DB"/>
-              <w:top w:sz="6.400000000000091" w:val="single" w:color="#E7E4DB"/>
-              <w:end w:sz="6.400000000000091" w:val="single" w:color="#E7E4DB"/>
-              <w:bottom w:sz="5.599999999999909" w:val="single" w:color="#E7E4DB"/>
+              <w:top w:sz="5.599999999999909" w:val="single" w:color="#E7E4DB"/>
+              <w:end w:sz="5.599999999999909" w:val="single" w:color="#E7E4DB"/>
+              <w:bottom w:sz="6.400000000000091" w:val="single" w:color="#E7E4DB"/>
             </w:tcBorders>
             <w:tcMar>
               <w:start w:w="0" w:type="dxa"/>
@@ -4487,7 +4502,7 @@
               <w:autoSpaceDE w:val="0"/>
               <w:widowControl/>
               <w:spacing w:line="240" w:lineRule="auto" w:before="106" w:after="0"/>
-              <w:ind w:left="148" w:right="0" w:firstLine="0"/>
+              <w:ind w:left="156" w:right="0" w:firstLine="0"/>
               <w:jc w:val="left"/>
             </w:pPr>
             <w:r>
@@ -4505,12 +4520,12 @@
         </w:tc>
         <w:tc>
           <w:tcPr>
-            <w:tcW w:type="dxa" w:w="2610"/>
+            <w:tcW w:type="dxa" w:w="2520"/>
             <w:tcBorders>
-              <w:start w:sz="6.400000000000091" w:val="single" w:color="#E7E4DB"/>
-              <w:top w:sz="6.400000000000091" w:val="single" w:color="#E7E4DB"/>
+              <w:start w:sz="5.599999999999909" w:val="single" w:color="#E7E4DB"/>
+              <w:top w:sz="5.599999999999909" w:val="single" w:color="#E7E4DB"/>
               <w:end w:sz="5.599999999999909" w:val="single" w:color="#E7E4DB"/>
-              <w:bottom w:sz="5.599999999999909" w:val="single" w:color="#E7E4DB"/>
+              <w:bottom w:sz="6.400000000000091" w:val="single" w:color="#E7E4DB"/>
             </w:tcBorders>
             <w:tcMar>
               <w:start w:w="0" w:type="dxa"/>
@@ -4523,7 +4538,7 @@
               <w:autoSpaceDE w:val="0"/>
               <w:widowControl/>
               <w:spacing w:line="266" w:lineRule="auto" w:before="106" w:after="0"/>
-              <w:ind w:left="154" w:right="288" w:firstLine="0"/>
+              <w:ind w:left="150" w:right="144" w:firstLine="0"/>
               <w:jc w:val="left"/>
             </w:pPr>
             <w:r>
@@ -4601,12 +4616,12 @@
         </w:tc>
         <w:tc>
           <w:tcPr>
-            <w:tcW w:type="dxa" w:w="1590"/>
+            <w:tcW w:type="dxa" w:w="1574"/>
             <w:tcBorders>
               <w:start w:sz="5.599999999999909" w:val="single" w:color="#E7E4DB"/>
-              <w:top w:sz="6.400000000000091" w:val="single" w:color="#E7E4DB"/>
+              <w:top w:sz="5.599999999999909" w:val="single" w:color="#E7E4DB"/>
               <w:end w:sz="6.399999999999636" w:val="single" w:color="#E7E4DB"/>
-              <w:bottom w:sz="5.599999999999909" w:val="single" w:color="#E7E4DB"/>
+              <w:bottom w:sz="6.400000000000091" w:val="single" w:color="#E7E4DB"/>
             </w:tcBorders>
             <w:tcMar>
               <w:start w:w="0" w:type="dxa"/>
@@ -4619,7 +4634,7 @@
               <w:autoSpaceDE w:val="0"/>
               <w:widowControl/>
               <w:spacing w:line="262" w:lineRule="auto" w:before="106" w:after="0"/>
-              <w:ind w:left="142" w:right="432" w:firstLine="0"/>
+              <w:ind w:left="152" w:right="288" w:firstLine="0"/>
               <w:jc w:val="left"/>
             </w:pPr>
             <w:r>
@@ -4659,9 +4674,9 @@
             <w:tcW w:type="dxa" w:w="1756"/>
             <w:tcBorders>
               <w:start w:sz="6.399999999999977" w:val="single" w:color="#E7E4DB"/>
-              <w:top w:sz="5.599999999999909" w:val="single" w:color="#E7E4DB"/>
+              <w:top w:sz="6.400000000000091" w:val="single" w:color="#E7E4DB"/>
               <w:end w:sz="5.599999999999909" w:val="single" w:color="#E7E4DB"/>
-              <w:bottom w:sz="5.599999999999909" w:val="single" w:color="#E7E4DB"/>
+              <w:bottom w:sz="6.400000000000091" w:val="single" w:color="#E7E4DB"/>
             </w:tcBorders>
             <w:tcMar>
               <w:start w:w="0" w:type="dxa"/>
@@ -4673,7 +4688,7 @@
               <w:autoSpaceDN w:val="0"/>
               <w:autoSpaceDE w:val="0"/>
               <w:widowControl/>
-              <w:spacing w:line="240" w:lineRule="auto" w:before="108" w:after="0"/>
+              <w:spacing w:line="240" w:lineRule="auto" w:before="106" w:after="0"/>
               <w:ind w:left="0" w:right="0" w:firstLine="0"/>
               <w:jc w:val="center"/>
             </w:pPr>
@@ -4692,12 +4707,12 @@
         </w:tc>
         <w:tc>
           <w:tcPr>
-            <w:tcW w:type="dxa" w:w="1872"/>
+            <w:tcW w:type="dxa" w:w="1992"/>
             <w:tcBorders>
               <w:start w:sz="5.599999999999909" w:val="single" w:color="#E7E4DB"/>
-              <w:top w:sz="5.599999999999909" w:val="single" w:color="#E7E4DB"/>
+              <w:top w:sz="6.400000000000091" w:val="single" w:color="#E7E4DB"/>
               <w:end w:sz="5.599999999999909" w:val="single" w:color="#E7E4DB"/>
-              <w:bottom w:sz="5.599999999999909" w:val="single" w:color="#E7E4DB"/>
+              <w:bottom w:sz="6.400000000000091" w:val="single" w:color="#E7E4DB"/>
             </w:tcBorders>
             <w:tcMar>
               <w:start w:w="0" w:type="dxa"/>
@@ -4709,8 +4724,8 @@
               <w:autoSpaceDN w:val="0"/>
               <w:autoSpaceDE w:val="0"/>
               <w:widowControl/>
-              <w:spacing w:line="240" w:lineRule="auto" w:before="108" w:after="0"/>
-              <w:ind w:left="144" w:right="0" w:firstLine="0"/>
+              <w:spacing w:line="240" w:lineRule="auto" w:before="106" w:after="0"/>
+              <w:ind w:left="142" w:right="0" w:firstLine="0"/>
               <w:jc w:val="left"/>
             </w:pPr>
             <w:r>
@@ -4728,12 +4743,12 @@
         </w:tc>
         <w:tc>
           <w:tcPr>
-            <w:tcW w:type="dxa" w:w="2236"/>
+            <w:tcW w:type="dxa" w:w="2222"/>
             <w:tcBorders>
               <w:start w:sz="5.599999999999909" w:val="single" w:color="#E7E4DB"/>
-              <w:top w:sz="5.599999999999909" w:val="single" w:color="#E7E4DB"/>
-              <w:end w:sz="6.400000000000091" w:val="single" w:color="#E7E4DB"/>
-              <w:bottom w:sz="5.599999999999909" w:val="single" w:color="#E7E4DB"/>
+              <w:top w:sz="6.400000000000091" w:val="single" w:color="#E7E4DB"/>
+              <w:end w:sz="5.599999999999909" w:val="single" w:color="#E7E4DB"/>
+              <w:bottom w:sz="6.400000000000091" w:val="single" w:color="#E7E4DB"/>
             </w:tcBorders>
             <w:tcMar>
               <w:start w:w="0" w:type="dxa"/>
@@ -4745,8 +4760,8 @@
               <w:autoSpaceDN w:val="0"/>
               <w:autoSpaceDE w:val="0"/>
               <w:widowControl/>
-              <w:spacing w:line="262" w:lineRule="auto" w:before="108" w:after="0"/>
-              <w:ind w:left="148" w:right="720" w:firstLine="0"/>
+              <w:spacing w:line="254" w:lineRule="auto" w:before="106" w:after="0"/>
+              <w:ind w:left="156" w:right="720" w:firstLine="0"/>
               <w:jc w:val="left"/>
             </w:pPr>
             <w:r>
@@ -4775,12 +4790,12 @@
         </w:tc>
         <w:tc>
           <w:tcPr>
-            <w:tcW w:type="dxa" w:w="2610"/>
+            <w:tcW w:type="dxa" w:w="2520"/>
             <w:tcBorders>
-              <w:start w:sz="6.400000000000091" w:val="single" w:color="#E7E4DB"/>
-              <w:top w:sz="5.599999999999909" w:val="single" w:color="#E7E4DB"/>
+              <w:start w:sz="5.599999999999909" w:val="single" w:color="#E7E4DB"/>
+              <w:top w:sz="6.400000000000091" w:val="single" w:color="#E7E4DB"/>
               <w:end w:sz="5.599999999999909" w:val="single" w:color="#E7E4DB"/>
-              <w:bottom w:sz="5.599999999999909" w:val="single" w:color="#E7E4DB"/>
+              <w:bottom w:sz="6.400000000000091" w:val="single" w:color="#E7E4DB"/>
             </w:tcBorders>
             <w:tcMar>
               <w:start w:w="0" w:type="dxa"/>
@@ -4792,8 +4807,8 @@
               <w:autoSpaceDN w:val="0"/>
               <w:autoSpaceDE w:val="0"/>
               <w:widowControl/>
-              <w:spacing w:line="262" w:lineRule="auto" w:before="108" w:after="0"/>
-              <w:ind w:left="154" w:right="288" w:firstLine="0"/>
+              <w:spacing w:line="254" w:lineRule="auto" w:before="106" w:after="0"/>
+              <w:ind w:left="150" w:right="144" w:firstLine="0"/>
               <w:jc w:val="left"/>
             </w:pPr>
             <w:r>
@@ -4822,12 +4837,12 @@
         </w:tc>
         <w:tc>
           <w:tcPr>
-            <w:tcW w:type="dxa" w:w="1590"/>
+            <w:tcW w:type="dxa" w:w="1574"/>
             <w:tcBorders>
               <w:start w:sz="5.599999999999909" w:val="single" w:color="#E7E4DB"/>
-              <w:top w:sz="5.599999999999909" w:val="single" w:color="#E7E4DB"/>
+              <w:top w:sz="6.400000000000091" w:val="single" w:color="#E7E4DB"/>
               <w:end w:sz="6.399999999999636" w:val="single" w:color="#E7E4DB"/>
-              <w:bottom w:sz="5.599999999999909" w:val="single" w:color="#E7E4DB"/>
+              <w:bottom w:sz="6.400000000000091" w:val="single" w:color="#E7E4DB"/>
             </w:tcBorders>
             <w:tcMar>
               <w:start w:w="0" w:type="dxa"/>
@@ -4839,8 +4854,8 @@
               <w:autoSpaceDN w:val="0"/>
               <w:autoSpaceDE w:val="0"/>
               <w:widowControl/>
-              <w:spacing w:line="262" w:lineRule="auto" w:before="108" w:after="0"/>
-              <w:ind w:left="142" w:right="432" w:firstLine="0"/>
+              <w:spacing w:line="254" w:lineRule="auto" w:before="106" w:after="0"/>
+              <w:ind w:left="152" w:right="288" w:firstLine="0"/>
               <w:jc w:val="left"/>
             </w:pPr>
             <w:r>
@@ -4937,7 +4952,7 @@
         <w:autoSpaceDN w:val="0"/>
         <w:autoSpaceDE w:val="0"/>
         <w:widowControl/>
-        <w:spacing w:line="271" w:lineRule="auto" w:before="218" w:after="402"/>
+        <w:spacing w:line="271" w:lineRule="auto" w:before="218" w:after="0"/>
         <w:ind w:left="180" w:right="144" w:firstLine="0"/>
         <w:jc w:val="left"/>
       </w:pPr>
@@ -4992,523 +5007,12 @@
         <w:t>opción D.</w:t>
       </w:r>
     </w:p>
-    <w:tbl>
-      <w:tblPr>
-        <w:tblW w:type="auto" w:w="0"/>
-        <w:tblLayout w:type="fixed"/>
-        <w:tblLook w:firstColumn="1" w:firstRow="1" w:lastColumn="0" w:lastRow="0" w:noHBand="0" w:noVBand="1" w:val="04A0"/>
-        <w:tblInd w:w="187.99999999999997" w:type="dxa"/>
-      </w:tblPr>
-      <w:tblGrid>
-        <w:gridCol w:w="1743"/>
-        <w:gridCol w:w="1743"/>
-        <w:gridCol w:w="1743"/>
-        <w:gridCol w:w="1743"/>
-        <w:gridCol w:w="1743"/>
-        <w:gridCol w:w="1743"/>
-      </w:tblGrid>
-      <w:tr>
-        <w:trPr>
-          <w:trHeight w:hRule="exact" w:val="706"/>
-        </w:trPr>
-        <w:tc>
-          <w:tcPr>
-            <w:tcW w:type="dxa" w:w="720"/>
-            <w:tcBorders>
-              <w:start w:sz="6.399999999999977" w:val="single" w:color="#E7E4DB"/>
-              <w:top w:sz="6.399999999999636" w:val="single" w:color="#E7E4DB"/>
-              <w:end w:sz="6.399999999999977" w:val="single" w:color="#E7E4DB"/>
-              <w:bottom w:sz="5.600000000000364" w:val="single" w:color="#E7E4DB"/>
-            </w:tcBorders>
-            <w:shd w:fill="f5f2ec"/>
-            <w:tcMar>
-              <w:start w:w="0" w:type="dxa"/>
-              <w:end w:w="0" w:type="dxa"/>
-            </w:tcMar>
-          </w:tcPr>
-          <w:p>
-            <w:pPr>
-              <w:autoSpaceDN w:val="0"/>
-              <w:autoSpaceDE w:val="0"/>
-              <w:widowControl/>
-              <w:spacing w:line="240" w:lineRule="auto" w:before="74" w:after="0"/>
-              <w:ind w:left="88" w:right="0" w:firstLine="0"/>
-              <w:jc w:val="left"/>
-            </w:pPr>
-            <w:r>
-              <w:rPr>
-                <w:w w:val="98.4000015258789"/>
-                <w:rFonts w:ascii="Anthropic Sans Print" w:hAnsi="Anthropic Sans Print" w:eastAsia="Anthropic Sans Print"/>
-                <w:b w:val="0"/>
-                <w:i w:val="0"/>
-                <w:color w:val="52514E"/>
-                <w:sz w:val="20"/>
-              </w:rPr>
-              <w:t>Ítem</w:t>
-            </w:r>
-          </w:p>
-        </w:tc>
-        <w:tc>
-          <w:tcPr>
-            <w:tcW w:type="dxa" w:w="4860"/>
-            <w:tcBorders>
-              <w:start w:sz="6.399999999999977" w:val="single" w:color="#E7E4DB"/>
-              <w:top w:sz="6.399999999999636" w:val="single" w:color="#E7E4DB"/>
-              <w:end w:sz="6.400000000000091" w:val="single" w:color="#E7E4DB"/>
-              <w:bottom w:sz="5.600000000000364" w:val="single" w:color="#E7E4DB"/>
-            </w:tcBorders>
-            <w:shd w:fill="f5f2ec"/>
-            <w:tcMar>
-              <w:start w:w="0" w:type="dxa"/>
-              <w:end w:w="0" w:type="dxa"/>
-            </w:tcMar>
-          </w:tcPr>
-          <w:p>
-            <w:pPr>
-              <w:autoSpaceDN w:val="0"/>
-              <w:autoSpaceDE w:val="0"/>
-              <w:widowControl/>
-              <w:spacing w:line="240" w:lineRule="auto" w:before="74" w:after="0"/>
-              <w:ind w:left="88" w:right="0" w:firstLine="0"/>
-              <w:jc w:val="left"/>
-            </w:pPr>
-            <w:r>
-              <w:rPr>
-                <w:w w:val="98.4000015258789"/>
-                <w:rFonts w:ascii="Anthropic Sans Print" w:hAnsi="Anthropic Sans Print" w:eastAsia="Anthropic Sans Print"/>
-                <w:b w:val="0"/>
-                <w:i w:val="0"/>
-                <w:color w:val="52514E"/>
-                <w:sz w:val="20"/>
-              </w:rPr>
-              <w:t>Descripción</w:t>
-            </w:r>
-          </w:p>
-        </w:tc>
-        <w:tc>
-          <w:tcPr>
-            <w:tcW w:type="dxa" w:w="720"/>
-            <w:tcBorders>
-              <w:start w:sz="6.400000000000091" w:val="single" w:color="#E7E4DB"/>
-              <w:top w:sz="6.399999999999636" w:val="single" w:color="#E7E4DB"/>
-              <w:end w:sz="6.400000000000091" w:val="single" w:color="#E7E4DB"/>
-              <w:bottom w:sz="5.600000000000364" w:val="single" w:color="#E7E4DB"/>
-            </w:tcBorders>
-            <w:shd w:fill="f5f2ec"/>
-            <w:tcMar>
-              <w:start w:w="0" w:type="dxa"/>
-              <w:end w:w="0" w:type="dxa"/>
-            </w:tcMar>
-          </w:tcPr>
-          <w:p>
-            <w:pPr>
-              <w:autoSpaceDN w:val="0"/>
-              <w:autoSpaceDE w:val="0"/>
-              <w:widowControl/>
-              <w:spacing w:line="240" w:lineRule="auto" w:before="74" w:after="0"/>
-              <w:ind w:left="0" w:right="0" w:firstLine="0"/>
-              <w:jc w:val="center"/>
-            </w:pPr>
-            <w:r>
-              <w:rPr>
-                <w:w w:val="98.4000015258789"/>
-                <w:rFonts w:ascii="Anthropic Sans Print" w:hAnsi="Anthropic Sans Print" w:eastAsia="Anthropic Sans Print"/>
-                <w:b w:val="0"/>
-                <w:i w:val="0"/>
-                <w:color w:val="52514E"/>
-                <w:sz w:val="20"/>
-              </w:rPr>
-              <w:t>Cant.</w:t>
-            </w:r>
-          </w:p>
-        </w:tc>
-        <w:tc>
-          <w:tcPr>
-            <w:tcW w:type="dxa" w:w="854"/>
-            <w:tcBorders>
-              <w:start w:sz="6.400000000000091" w:val="single" w:color="#E7E4DB"/>
-              <w:top w:sz="6.399999999999636" w:val="single" w:color="#E7E4DB"/>
-              <w:end w:sz="5.599999999999909" w:val="single" w:color="#E7E4DB"/>
-              <w:bottom w:sz="5.600000000000364" w:val="single" w:color="#E7E4DB"/>
-            </w:tcBorders>
-            <w:shd w:fill="f5f2ec"/>
-            <w:tcMar>
-              <w:start w:w="0" w:type="dxa"/>
-              <w:end w:w="0" w:type="dxa"/>
-            </w:tcMar>
-          </w:tcPr>
-          <w:p>
-            <w:pPr>
-              <w:autoSpaceDN w:val="0"/>
-              <w:autoSpaceDE w:val="0"/>
-              <w:widowControl/>
-              <w:spacing w:line="240" w:lineRule="auto" w:before="74" w:after="0"/>
-              <w:ind w:left="0" w:right="0" w:firstLine="0"/>
-              <w:jc w:val="center"/>
-            </w:pPr>
-            <w:r>
-              <w:rPr>
-                <w:w w:val="98.4000015258789"/>
-                <w:rFonts w:ascii="Anthropic Sans Print" w:hAnsi="Anthropic Sans Print" w:eastAsia="Anthropic Sans Print"/>
-                <w:b w:val="0"/>
-                <w:i w:val="0"/>
-                <w:color w:val="52514E"/>
-                <w:sz w:val="20"/>
-              </w:rPr>
-              <w:t>Unidad</w:t>
-            </w:r>
-          </w:p>
-        </w:tc>
-        <w:tc>
-          <w:tcPr>
-            <w:tcW w:type="dxa" w:w="1696"/>
-            <w:tcBorders>
-              <w:start w:sz="5.599999999999909" w:val="single" w:color="#E7E4DB"/>
-              <w:top w:sz="6.399999999999636" w:val="single" w:color="#E7E4DB"/>
-              <w:end w:sz="5.599999999999909" w:val="single" w:color="#E7E4DB"/>
-              <w:bottom w:sz="5.600000000000364" w:val="single" w:color="#E7E4DB"/>
-            </w:tcBorders>
-            <w:shd w:fill="f5f2ec"/>
-            <w:tcMar>
-              <w:start w:w="0" w:type="dxa"/>
-              <w:end w:w="0" w:type="dxa"/>
-            </w:tcMar>
-          </w:tcPr>
-          <w:p>
-            <w:pPr>
-              <w:autoSpaceDN w:val="0"/>
-              <w:autoSpaceDE w:val="0"/>
-              <w:widowControl/>
-              <w:spacing w:line="259" w:lineRule="auto" w:before="74" w:after="0"/>
-              <w:ind w:left="90" w:right="576" w:firstLine="0"/>
-              <w:jc w:val="left"/>
-            </w:pPr>
-            <w:r>
-              <w:rPr>
-                <w:w w:val="98.4000015258789"/>
-                <w:rFonts w:ascii="Anthropic Sans Print" w:hAnsi="Anthropic Sans Print" w:eastAsia="Anthropic Sans Print"/>
-                <w:b w:val="0"/>
-                <w:i w:val="0"/>
-                <w:color w:val="52514E"/>
-                <w:sz w:val="20"/>
-              </w:rPr>
-              <w:t xml:space="preserve">P. unit. ref. </w:t>
-            </w:r>
-            <w:r>
-              <w:rPr>
-                <w:w w:val="98.4000015258789"/>
-                <w:rFonts w:ascii="Anthropic Sans Print" w:hAnsi="Anthropic Sans Print" w:eastAsia="Anthropic Sans Print"/>
-                <w:b w:val="0"/>
-                <w:i w:val="0"/>
-                <w:color w:val="52514E"/>
-                <w:sz w:val="20"/>
-              </w:rPr>
-              <w:t>(USD)</w:t>
-            </w:r>
-          </w:p>
-        </w:tc>
-        <w:tc>
-          <w:tcPr>
-            <w:tcW w:type="dxa" w:w="1214"/>
-            <w:tcBorders>
-              <w:start w:sz="5.599999999999909" w:val="single" w:color="#E7E4DB"/>
-              <w:top w:sz="6.399999999999636" w:val="single" w:color="#E7E4DB"/>
-              <w:end w:sz="6.399999999999636" w:val="single" w:color="#E7E4DB"/>
-              <w:bottom w:sz="5.600000000000364" w:val="single" w:color="#E7E4DB"/>
-            </w:tcBorders>
-            <w:shd w:fill="f5f2ec"/>
-            <w:tcMar>
-              <w:start w:w="0" w:type="dxa"/>
-              <w:end w:w="0" w:type="dxa"/>
-            </w:tcMar>
-          </w:tcPr>
-          <w:p>
-            <w:pPr>
-              <w:autoSpaceDN w:val="0"/>
-              <w:autoSpaceDE w:val="0"/>
-              <w:widowControl/>
-              <w:spacing w:line="259" w:lineRule="auto" w:before="74" w:after="0"/>
-              <w:ind w:left="88" w:right="432" w:firstLine="0"/>
-              <w:jc w:val="left"/>
-            </w:pPr>
-            <w:r>
-              <w:rPr>
-                <w:w w:val="98.4000015258789"/>
-                <w:rFonts w:ascii="Anthropic Sans Print" w:hAnsi="Anthropic Sans Print" w:eastAsia="Anthropic Sans Print"/>
-                <w:b w:val="0"/>
-                <w:i w:val="0"/>
-                <w:color w:val="52514E"/>
-                <w:sz w:val="20"/>
-              </w:rPr>
-              <w:t xml:space="preserve">Total </w:t>
-            </w:r>
-            <w:r>
-              <w:br/>
-            </w:r>
-            <w:r>
-              <w:rPr>
-                <w:w w:val="98.4000015258789"/>
-                <w:rFonts w:ascii="Anthropic Sans Print" w:hAnsi="Anthropic Sans Print" w:eastAsia="Anthropic Sans Print"/>
-                <w:b w:val="0"/>
-                <w:i w:val="0"/>
-                <w:color w:val="52514E"/>
-                <w:sz w:val="20"/>
-              </w:rPr>
-              <w:t>(CLP)</w:t>
-            </w:r>
-          </w:p>
-        </w:tc>
-      </w:tr>
-      <w:tr>
-        <w:trPr>
-          <w:trHeight w:hRule="exact" w:val="1004"/>
-        </w:trPr>
-        <w:tc>
-          <w:tcPr>
-            <w:tcW w:type="dxa" w:w="720"/>
-            <w:tcBorders>
-              <w:start w:sz="6.399999999999977" w:val="single" w:color="#E7E4DB"/>
-              <w:top w:sz="5.600000000000364" w:val="single" w:color="#E7E4DB"/>
-              <w:end w:sz="6.399999999999977" w:val="single" w:color="#E7E4DB"/>
-              <w:bottom w:sz="5.600000000000364" w:val="single" w:color="#E7E4DB"/>
-            </w:tcBorders>
-            <w:tcMar>
-              <w:start w:w="0" w:type="dxa"/>
-              <w:end w:w="0" w:type="dxa"/>
-            </w:tcMar>
-          </w:tcPr>
-          <w:p>
-            <w:pPr>
-              <w:autoSpaceDN w:val="0"/>
-              <w:autoSpaceDE w:val="0"/>
-              <w:widowControl/>
-              <w:spacing w:line="240" w:lineRule="auto" w:before="76" w:after="0"/>
-              <w:ind w:left="88" w:right="0" w:firstLine="0"/>
-              <w:jc w:val="left"/>
-            </w:pPr>
-            <w:r>
-              <w:rPr>
-                <w:w w:val="98.4000015258789"/>
-                <w:rFonts w:ascii="Anthropic Sans Print" w:hAnsi="Anthropic Sans Print" w:eastAsia="Anthropic Sans Print"/>
-                <w:b w:val="0"/>
-                <w:i w:val="0"/>
-                <w:color w:val="1F1E1D"/>
-                <w:sz w:val="20"/>
-              </w:rPr>
-              <w:t>1</w:t>
-            </w:r>
-          </w:p>
-        </w:tc>
-        <w:tc>
-          <w:tcPr>
-            <w:tcW w:type="dxa" w:w="4860"/>
-            <w:tcBorders>
-              <w:start w:sz="6.399999999999977" w:val="single" w:color="#E7E4DB"/>
-              <w:top w:sz="5.600000000000364" w:val="single" w:color="#E7E4DB"/>
-              <w:end w:sz="6.400000000000091" w:val="single" w:color="#E7E4DB"/>
-              <w:bottom w:sz="5.600000000000364" w:val="single" w:color="#E7E4DB"/>
-            </w:tcBorders>
-            <w:tcMar>
-              <w:start w:w="0" w:type="dxa"/>
-              <w:end w:w="0" w:type="dxa"/>
-            </w:tcMar>
-          </w:tcPr>
-          <w:p>
-            <w:pPr>
-              <w:autoSpaceDN w:val="0"/>
-              <w:autoSpaceDE w:val="0"/>
-              <w:widowControl/>
-              <w:spacing w:line="266" w:lineRule="auto" w:before="76" w:after="0"/>
-              <w:ind w:left="88" w:right="288" w:firstLine="0"/>
-              <w:jc w:val="left"/>
-            </w:pPr>
-            <w:r>
-              <w:rPr>
-                <w:w w:val="98.4000015258789"/>
-                <w:rFonts w:ascii="Anthropic Sans Print" w:hAnsi="Anthropic Sans Print" w:eastAsia="Anthropic Sans Print"/>
-                <w:b w:val="0"/>
-                <w:i w:val="0"/>
-                <w:color w:val="1F1E1D"/>
-                <w:sz w:val="20"/>
-              </w:rPr>
-              <w:t xml:space="preserve">Lámpara LED blanca de 72 Vcc, casquillo BA15d </w:t>
-            </w:r>
-            <w:r>
-              <w:rPr>
-                <w:w w:val="98.4000015258789"/>
-                <w:rFonts w:ascii="Anthropic Sans Print" w:hAnsi="Anthropic Sans Print" w:eastAsia="Anthropic Sans Print"/>
-                <w:b w:val="0"/>
-                <w:i w:val="0"/>
-                <w:color w:val="1F1E1D"/>
-                <w:sz w:val="20"/>
-              </w:rPr>
-              <w:t xml:space="preserve">(numeradores, cabina y estribos), 28 + 3 de </w:t>
-            </w:r>
-            <w:r>
-              <w:rPr>
-                <w:w w:val="98.4000015258789"/>
-                <w:rFonts w:ascii="Anthropic Sans Print" w:hAnsi="Anthropic Sans Print" w:eastAsia="Anthropic Sans Print"/>
-                <w:b w:val="0"/>
-                <w:i w:val="0"/>
-                <w:color w:val="1F1E1D"/>
-                <w:sz w:val="20"/>
-              </w:rPr>
-              <w:t>repuesto</w:t>
-            </w:r>
-          </w:p>
-        </w:tc>
-        <w:tc>
-          <w:tcPr>
-            <w:tcW w:type="dxa" w:w="720"/>
-            <w:tcBorders>
-              <w:start w:sz="6.400000000000091" w:val="single" w:color="#E7E4DB"/>
-              <w:top w:sz="5.600000000000364" w:val="single" w:color="#E7E4DB"/>
-              <w:end w:sz="6.400000000000091" w:val="single" w:color="#E7E4DB"/>
-              <w:bottom w:sz="5.600000000000364" w:val="single" w:color="#E7E4DB"/>
-            </w:tcBorders>
-            <w:tcMar>
-              <w:start w:w="0" w:type="dxa"/>
-              <w:end w:w="0" w:type="dxa"/>
-            </w:tcMar>
-          </w:tcPr>
-          <w:p>
-            <w:pPr>
-              <w:autoSpaceDN w:val="0"/>
-              <w:autoSpaceDE w:val="0"/>
-              <w:widowControl/>
-              <w:spacing w:line="240" w:lineRule="auto" w:before="76" w:after="0"/>
-              <w:ind w:left="92" w:right="0" w:firstLine="0"/>
-              <w:jc w:val="left"/>
-            </w:pPr>
-            <w:r>
-              <w:rPr>
-                <w:w w:val="98.4000015258789"/>
-                <w:rFonts w:ascii="Anthropic Sans Print" w:hAnsi="Anthropic Sans Print" w:eastAsia="Anthropic Sans Print"/>
-                <w:b w:val="0"/>
-                <w:i w:val="0"/>
-                <w:color w:val="1F1E1D"/>
-                <w:sz w:val="20"/>
-              </w:rPr>
-              <w:t>31</w:t>
-            </w:r>
-          </w:p>
-        </w:tc>
-        <w:tc>
-          <w:tcPr>
-            <w:tcW w:type="dxa" w:w="854"/>
-            <w:tcBorders>
-              <w:start w:sz="6.400000000000091" w:val="single" w:color="#E7E4DB"/>
-              <w:top w:sz="5.600000000000364" w:val="single" w:color="#E7E4DB"/>
-              <w:end w:sz="5.599999999999909" w:val="single" w:color="#E7E4DB"/>
-              <w:bottom w:sz="5.600000000000364" w:val="single" w:color="#E7E4DB"/>
-            </w:tcBorders>
-            <w:tcMar>
-              <w:start w:w="0" w:type="dxa"/>
-              <w:end w:w="0" w:type="dxa"/>
-            </w:tcMar>
-          </w:tcPr>
-          <w:p>
-            <w:pPr>
-              <w:autoSpaceDN w:val="0"/>
-              <w:autoSpaceDE w:val="0"/>
-              <w:widowControl/>
-              <w:spacing w:line="240" w:lineRule="auto" w:before="76" w:after="0"/>
-              <w:ind w:left="92" w:right="0" w:firstLine="0"/>
-              <w:jc w:val="left"/>
-            </w:pPr>
-            <w:r>
-              <w:rPr>
-                <w:w w:val="98.4000015258789"/>
-                <w:rFonts w:ascii="Anthropic Sans Print" w:hAnsi="Anthropic Sans Print" w:eastAsia="Anthropic Sans Print"/>
-                <w:b w:val="0"/>
-                <w:i w:val="0"/>
-                <w:color w:val="1F1E1D"/>
-                <w:sz w:val="20"/>
-              </w:rPr>
-              <w:t>un</w:t>
-            </w:r>
-          </w:p>
-        </w:tc>
-        <w:tc>
-          <w:tcPr>
-            <w:tcW w:type="dxa" w:w="1696"/>
-            <w:tcBorders>
-              <w:start w:sz="5.599999999999909" w:val="single" w:color="#E7E4DB"/>
-              <w:top w:sz="5.600000000000364" w:val="single" w:color="#E7E4DB"/>
-              <w:end w:sz="5.599999999999909" w:val="single" w:color="#E7E4DB"/>
-              <w:bottom w:sz="5.600000000000364" w:val="single" w:color="#E7E4DB"/>
-            </w:tcBorders>
-            <w:tcMar>
-              <w:start w:w="0" w:type="dxa"/>
-              <w:end w:w="0" w:type="dxa"/>
-            </w:tcMar>
-          </w:tcPr>
-          <w:p>
-            <w:pPr>
-              <w:autoSpaceDN w:val="0"/>
-              <w:autoSpaceDE w:val="0"/>
-              <w:widowControl/>
-              <w:spacing w:line="240" w:lineRule="auto" w:before="76" w:after="0"/>
-              <w:ind w:left="90" w:right="0" w:firstLine="0"/>
-              <w:jc w:val="left"/>
-            </w:pPr>
-            <w:r>
-              <w:rPr>
-                <w:w w:val="98.4000015258789"/>
-                <w:rFonts w:ascii="Anthropic Sans Print" w:hAnsi="Anthropic Sans Print" w:eastAsia="Anthropic Sans Print"/>
-                <w:b w:val="0"/>
-                <w:i w:val="0"/>
-                <w:color w:val="1F1E1D"/>
-                <w:sz w:val="20"/>
-              </w:rPr>
-              <w:t>165,30</w:t>
-            </w:r>
-          </w:p>
-        </w:tc>
-        <w:tc>
-          <w:tcPr>
-            <w:tcW w:type="dxa" w:w="1214"/>
-            <w:tcBorders>
-              <w:start w:sz="5.599999999999909" w:val="single" w:color="#E7E4DB"/>
-              <w:top w:sz="5.600000000000364" w:val="single" w:color="#E7E4DB"/>
-              <w:end w:sz="6.399999999999636" w:val="single" w:color="#E7E4DB"/>
-              <w:bottom w:sz="5.600000000000364" w:val="single" w:color="#E7E4DB"/>
-            </w:tcBorders>
-            <w:tcMar>
-              <w:start w:w="0" w:type="dxa"/>
-              <w:end w:w="0" w:type="dxa"/>
-            </w:tcMar>
-          </w:tcPr>
-          <w:p>
-            <w:pPr>
-              <w:autoSpaceDN w:val="0"/>
-              <w:autoSpaceDE w:val="0"/>
-              <w:widowControl/>
-              <w:spacing w:line="240" w:lineRule="auto" w:before="76" w:after="0"/>
-              <w:ind w:left="88" w:right="0" w:firstLine="0"/>
-              <w:jc w:val="left"/>
-            </w:pPr>
-            <w:r>
-              <w:rPr>
-                <w:w w:val="98.4000015258789"/>
-                <w:rFonts w:ascii="Anthropic Sans Print" w:hAnsi="Anthropic Sans Print" w:eastAsia="Anthropic Sans Print"/>
-                <w:b w:val="0"/>
-                <w:i w:val="0"/>
-                <w:color w:val="1F1E1D"/>
-                <w:sz w:val="20"/>
-              </w:rPr>
-              <w:t>4.868.085</w:t>
-            </w:r>
-          </w:p>
-        </w:tc>
-      </w:tr>
-    </w:tbl>
     <w:p>
       <w:pPr>
         <w:autoSpaceDN w:val="0"/>
         <w:autoSpaceDE w:val="0"/>
         <w:widowControl/>
-        <w:spacing w:line="240" w:lineRule="auto" w:before="908" w:after="0"/>
+        <w:spacing w:line="240" w:lineRule="auto" w:before="2346" w:after="0"/>
         <w:ind w:left="0" w:right="28" w:firstLine="0"/>
         <w:jc w:val="right"/>
       </w:pPr>
@@ -5547,7 +5051,7 @@
         <w:autoSpaceDN w:val="0"/>
         <w:autoSpaceDE w:val="0"/>
         <w:widowControl/>
-        <w:spacing w:line="240" w:lineRule="auto" w:before="0" w:after="586"/>
+        <w:spacing w:line="240" w:lineRule="auto" w:before="0" w:after="826"/>
         <w:ind w:left="8" w:right="0" w:firstLine="0"/>
         <w:jc w:val="left"/>
       </w:pPr>
@@ -5831,7 +5335,7 @@
       </w:tr>
       <w:tr>
         <w:trPr>
-          <w:trHeight w:hRule="exact" w:val="704"/>
+          <w:trHeight w:hRule="exact" w:val="992"/>
         </w:trPr>
         <w:tc>
           <w:tcPr>
@@ -5840,7 +5344,250 @@
               <w:start w:sz="6.399999999999977" w:val="single" w:color="#E7E4DB"/>
               <w:top w:sz="6.399999999999977" w:val="single" w:color="#E7E4DB"/>
               <w:end w:sz="6.399999999999977" w:val="single" w:color="#E7E4DB"/>
-              <w:bottom w:sz="5.600000000000023" w:val="single" w:color="#E7E4DB"/>
+              <w:bottom w:sz="5.599999999999909" w:val="single" w:color="#E7E4DB"/>
+            </w:tcBorders>
+            <w:tcMar>
+              <w:start w:w="0" w:type="dxa"/>
+              <w:end w:w="0" w:type="dxa"/>
+            </w:tcMar>
+          </w:tcPr>
+          <w:p>
+            <w:pPr>
+              <w:autoSpaceDN w:val="0"/>
+              <w:autoSpaceDE w:val="0"/>
+              <w:widowControl/>
+              <w:spacing w:line="240" w:lineRule="auto" w:before="74" w:after="0"/>
+              <w:ind w:left="88" w:right="0" w:firstLine="0"/>
+              <w:jc w:val="left"/>
+            </w:pPr>
+            <w:r>
+              <w:rPr>
+                <w:w w:val="98.4000015258789"/>
+                <w:rFonts w:ascii="Anthropic Sans Print" w:hAnsi="Anthropic Sans Print" w:eastAsia="Anthropic Sans Print"/>
+                <w:b w:val="0"/>
+                <w:i w:val="0"/>
+                <w:color w:val="1F1E1D"/>
+                <w:sz w:val="20"/>
+              </w:rPr>
+              <w:t>1</w:t>
+            </w:r>
+          </w:p>
+        </w:tc>
+        <w:tc>
+          <w:tcPr>
+            <w:tcW w:type="dxa" w:w="4860"/>
+            <w:tcBorders>
+              <w:start w:sz="6.399999999999977" w:val="single" w:color="#E7E4DB"/>
+              <w:top w:sz="6.399999999999977" w:val="single" w:color="#E7E4DB"/>
+              <w:end w:sz="6.400000000000091" w:val="single" w:color="#E7E4DB"/>
+              <w:bottom w:sz="5.599999999999909" w:val="single" w:color="#E7E4DB"/>
+            </w:tcBorders>
+            <w:tcMar>
+              <w:start w:w="0" w:type="dxa"/>
+              <w:end w:w="0" w:type="dxa"/>
+            </w:tcMar>
+          </w:tcPr>
+          <w:p>
+            <w:pPr>
+              <w:autoSpaceDN w:val="0"/>
+              <w:autoSpaceDE w:val="0"/>
+              <w:widowControl/>
+              <w:spacing w:line="266" w:lineRule="auto" w:before="74" w:after="0"/>
+              <w:ind w:left="88" w:right="288" w:firstLine="0"/>
+              <w:jc w:val="left"/>
+            </w:pPr>
+            <w:r>
+              <w:rPr>
+                <w:w w:val="98.4000015258789"/>
+                <w:rFonts w:ascii="Anthropic Sans Print" w:hAnsi="Anthropic Sans Print" w:eastAsia="Anthropic Sans Print"/>
+                <w:b w:val="0"/>
+                <w:i w:val="0"/>
+                <w:color w:val="1F1E1D"/>
+                <w:sz w:val="20"/>
+              </w:rPr>
+              <w:t xml:space="preserve">Lámpara LED blanca de 72 Vcc, casquillo BA15d </w:t>
+            </w:r>
+            <w:r>
+              <w:rPr>
+                <w:w w:val="98.4000015258789"/>
+                <w:rFonts w:ascii="Anthropic Sans Print" w:hAnsi="Anthropic Sans Print" w:eastAsia="Anthropic Sans Print"/>
+                <w:b w:val="0"/>
+                <w:i w:val="0"/>
+                <w:color w:val="1F1E1D"/>
+                <w:sz w:val="20"/>
+              </w:rPr>
+              <w:t xml:space="preserve">(numeradores, cabina y estribos), 28 + 3 de </w:t>
+            </w:r>
+            <w:r>
+              <w:rPr>
+                <w:w w:val="98.4000015258789"/>
+                <w:rFonts w:ascii="Anthropic Sans Print" w:hAnsi="Anthropic Sans Print" w:eastAsia="Anthropic Sans Print"/>
+                <w:b w:val="0"/>
+                <w:i w:val="0"/>
+                <w:color w:val="1F1E1D"/>
+                <w:sz w:val="20"/>
+              </w:rPr>
+              <w:t>repuesto</w:t>
+            </w:r>
+          </w:p>
+        </w:tc>
+        <w:tc>
+          <w:tcPr>
+            <w:tcW w:type="dxa" w:w="720"/>
+            <w:tcBorders>
+              <w:start w:sz="6.400000000000091" w:val="single" w:color="#E7E4DB"/>
+              <w:top w:sz="6.399999999999977" w:val="single" w:color="#E7E4DB"/>
+              <w:end w:sz="6.400000000000091" w:val="single" w:color="#E7E4DB"/>
+              <w:bottom w:sz="5.599999999999909" w:val="single" w:color="#E7E4DB"/>
+            </w:tcBorders>
+            <w:tcMar>
+              <w:start w:w="0" w:type="dxa"/>
+              <w:end w:w="0" w:type="dxa"/>
+            </w:tcMar>
+          </w:tcPr>
+          <w:p>
+            <w:pPr>
+              <w:autoSpaceDN w:val="0"/>
+              <w:autoSpaceDE w:val="0"/>
+              <w:widowControl/>
+              <w:spacing w:line="240" w:lineRule="auto" w:before="74" w:after="0"/>
+              <w:ind w:left="92" w:right="0" w:firstLine="0"/>
+              <w:jc w:val="left"/>
+            </w:pPr>
+            <w:r>
+              <w:rPr>
+                <w:w w:val="98.4000015258789"/>
+                <w:rFonts w:ascii="Anthropic Sans Print" w:hAnsi="Anthropic Sans Print" w:eastAsia="Anthropic Sans Print"/>
+                <w:b w:val="0"/>
+                <w:i w:val="0"/>
+                <w:color w:val="1F1E1D"/>
+                <w:sz w:val="20"/>
+              </w:rPr>
+              <w:t>31</w:t>
+            </w:r>
+          </w:p>
+        </w:tc>
+        <w:tc>
+          <w:tcPr>
+            <w:tcW w:type="dxa" w:w="854"/>
+            <w:tcBorders>
+              <w:start w:sz="6.400000000000091" w:val="single" w:color="#E7E4DB"/>
+              <w:top w:sz="6.399999999999977" w:val="single" w:color="#E7E4DB"/>
+              <w:end w:sz="5.599999999999909" w:val="single" w:color="#E7E4DB"/>
+              <w:bottom w:sz="5.599999999999909" w:val="single" w:color="#E7E4DB"/>
+            </w:tcBorders>
+            <w:tcMar>
+              <w:start w:w="0" w:type="dxa"/>
+              <w:end w:w="0" w:type="dxa"/>
+            </w:tcMar>
+          </w:tcPr>
+          <w:p>
+            <w:pPr>
+              <w:autoSpaceDN w:val="0"/>
+              <w:autoSpaceDE w:val="0"/>
+              <w:widowControl/>
+              <w:spacing w:line="240" w:lineRule="auto" w:before="74" w:after="0"/>
+              <w:ind w:left="92" w:right="0" w:firstLine="0"/>
+              <w:jc w:val="left"/>
+            </w:pPr>
+            <w:r>
+              <w:rPr>
+                <w:w w:val="98.4000015258789"/>
+                <w:rFonts w:ascii="Anthropic Sans Print" w:hAnsi="Anthropic Sans Print" w:eastAsia="Anthropic Sans Print"/>
+                <w:b w:val="0"/>
+                <w:i w:val="0"/>
+                <w:color w:val="1F1E1D"/>
+                <w:sz w:val="20"/>
+              </w:rPr>
+              <w:t>un</w:t>
+            </w:r>
+          </w:p>
+        </w:tc>
+        <w:tc>
+          <w:tcPr>
+            <w:tcW w:type="dxa" w:w="1696"/>
+            <w:tcBorders>
+              <w:start w:sz="5.599999999999909" w:val="single" w:color="#E7E4DB"/>
+              <w:top w:sz="6.399999999999977" w:val="single" w:color="#E7E4DB"/>
+              <w:end w:sz="5.599999999999909" w:val="single" w:color="#E7E4DB"/>
+              <w:bottom w:sz="5.599999999999909" w:val="single" w:color="#E7E4DB"/>
+            </w:tcBorders>
+            <w:tcMar>
+              <w:start w:w="0" w:type="dxa"/>
+              <w:end w:w="0" w:type="dxa"/>
+            </w:tcMar>
+          </w:tcPr>
+          <w:p>
+            <w:pPr>
+              <w:autoSpaceDN w:val="0"/>
+              <w:autoSpaceDE w:val="0"/>
+              <w:widowControl/>
+              <w:spacing w:line="240" w:lineRule="auto" w:before="74" w:after="0"/>
+              <w:ind w:left="90" w:right="0" w:firstLine="0"/>
+              <w:jc w:val="left"/>
+            </w:pPr>
+            <w:r>
+              <w:rPr>
+                <w:w w:val="98.4000015258789"/>
+                <w:rFonts w:ascii="Anthropic Sans Print" w:hAnsi="Anthropic Sans Print" w:eastAsia="Anthropic Sans Print"/>
+                <w:b w:val="0"/>
+                <w:i w:val="0"/>
+                <w:color w:val="1F1E1D"/>
+                <w:sz w:val="20"/>
+              </w:rPr>
+              <w:t>165,30</w:t>
+            </w:r>
+          </w:p>
+        </w:tc>
+        <w:tc>
+          <w:tcPr>
+            <w:tcW w:type="dxa" w:w="1214"/>
+            <w:tcBorders>
+              <w:start w:sz="5.599999999999909" w:val="single" w:color="#E7E4DB"/>
+              <w:top w:sz="6.399999999999977" w:val="single" w:color="#E7E4DB"/>
+              <w:end w:sz="6.399999999999636" w:val="single" w:color="#E7E4DB"/>
+              <w:bottom w:sz="5.599999999999909" w:val="single" w:color="#E7E4DB"/>
+            </w:tcBorders>
+            <w:tcMar>
+              <w:start w:w="0" w:type="dxa"/>
+              <w:end w:w="0" w:type="dxa"/>
+            </w:tcMar>
+          </w:tcPr>
+          <w:p>
+            <w:pPr>
+              <w:autoSpaceDN w:val="0"/>
+              <w:autoSpaceDE w:val="0"/>
+              <w:widowControl/>
+              <w:spacing w:line="240" w:lineRule="auto" w:before="74" w:after="0"/>
+              <w:ind w:left="88" w:right="0" w:firstLine="0"/>
+              <w:jc w:val="left"/>
+            </w:pPr>
+            <w:r>
+              <w:rPr>
+                <w:w w:val="98.4000015258789"/>
+                <w:rFonts w:ascii="Anthropic Sans Print" w:hAnsi="Anthropic Sans Print" w:eastAsia="Anthropic Sans Print"/>
+                <w:b w:val="0"/>
+                <w:i w:val="0"/>
+                <w:color w:val="1F1E1D"/>
+                <w:sz w:val="20"/>
+              </w:rPr>
+              <w:t>4.868.085</w:t>
+            </w:r>
+          </w:p>
+        </w:tc>
+      </w:tr>
+      <w:tr>
+        <w:trPr>
+          <w:trHeight w:hRule="exact" w:val="704"/>
+        </w:trPr>
+        <w:tc>
+          <w:tcPr>
+            <w:tcW w:type="dxa" w:w="720"/>
+            <w:tcBorders>
+              <w:start w:sz="6.399999999999977" w:val="single" w:color="#E7E4DB"/>
+              <w:top w:sz="5.599999999999909" w:val="single" w:color="#E7E4DB"/>
+              <w:end w:sz="6.399999999999977" w:val="single" w:color="#E7E4DB"/>
+              <w:bottom w:sz="6.400000000000091" w:val="single" w:color="#E7E4DB"/>
             </w:tcBorders>
             <w:tcMar>
               <w:start w:w="0" w:type="dxa"/>
@@ -5874,9 +5621,9 @@
             <w:tcW w:type="dxa" w:w="4860"/>
             <w:tcBorders>
               <w:start w:sz="6.399999999999977" w:val="single" w:color="#E7E4DB"/>
-              <w:top w:sz="6.399999999999977" w:val="single" w:color="#E7E4DB"/>
+              <w:top w:sz="5.599999999999909" w:val="single" w:color="#E7E4DB"/>
               <w:end w:sz="6.400000000000091" w:val="single" w:color="#E7E4DB"/>
-              <w:bottom w:sz="5.600000000000023" w:val="single" w:color="#E7E4DB"/>
+              <w:bottom w:sz="6.400000000000091" w:val="single" w:color="#E7E4DB"/>
             </w:tcBorders>
             <w:tcMar>
               <w:start w:w="0" w:type="dxa"/>
@@ -5921,470 +5668,6 @@
             <w:tcW w:type="dxa" w:w="720"/>
             <w:tcBorders>
               <w:start w:sz="6.400000000000091" w:val="single" w:color="#E7E4DB"/>
-              <w:top w:sz="6.399999999999977" w:val="single" w:color="#E7E4DB"/>
-              <w:end w:sz="6.400000000000091" w:val="single" w:color="#E7E4DB"/>
-              <w:bottom w:sz="5.600000000000023" w:val="single" w:color="#E7E4DB"/>
-            </w:tcBorders>
-            <w:tcMar>
-              <w:start w:w="0" w:type="dxa"/>
-              <w:end w:w="0" w:type="dxa"/>
-            </w:tcMar>
-          </w:tcPr>
-          <w:p>
-            <w:pPr>
-              <w:autoSpaceDN w:val="0"/>
-              <w:autoSpaceDE w:val="0"/>
-              <w:widowControl/>
-              <w:spacing w:line="240" w:lineRule="auto" w:before="74" w:after="0"/>
-              <w:ind w:left="92" w:right="0" w:firstLine="0"/>
-              <w:jc w:val="left"/>
-            </w:pPr>
-            <w:r>
-              <w:rPr>
-                <w:w w:val="98.4000015258789"/>
-                <w:rFonts w:ascii="Anthropic Sans Print" w:hAnsi="Anthropic Sans Print" w:eastAsia="Anthropic Sans Print"/>
-                <w:b w:val="0"/>
-                <w:i w:val="0"/>
-                <w:color w:val="1F1E1D"/>
-                <w:sz w:val="20"/>
-              </w:rPr>
-              <w:t>9</w:t>
-            </w:r>
-          </w:p>
-        </w:tc>
-        <w:tc>
-          <w:tcPr>
-            <w:tcW w:type="dxa" w:w="854"/>
-            <w:tcBorders>
-              <w:start w:sz="6.400000000000091" w:val="single" w:color="#E7E4DB"/>
-              <w:top w:sz="6.399999999999977" w:val="single" w:color="#E7E4DB"/>
-              <w:end w:sz="5.599999999999909" w:val="single" w:color="#E7E4DB"/>
-              <w:bottom w:sz="5.600000000000023" w:val="single" w:color="#E7E4DB"/>
-            </w:tcBorders>
-            <w:tcMar>
-              <w:start w:w="0" w:type="dxa"/>
-              <w:end w:w="0" w:type="dxa"/>
-            </w:tcMar>
-          </w:tcPr>
-          <w:p>
-            <w:pPr>
-              <w:autoSpaceDN w:val="0"/>
-              <w:autoSpaceDE w:val="0"/>
-              <w:widowControl/>
-              <w:spacing w:line="240" w:lineRule="auto" w:before="74" w:after="0"/>
-              <w:ind w:left="92" w:right="0" w:firstLine="0"/>
-              <w:jc w:val="left"/>
-            </w:pPr>
-            <w:r>
-              <w:rPr>
-                <w:w w:val="98.4000015258789"/>
-                <w:rFonts w:ascii="Anthropic Sans Print" w:hAnsi="Anthropic Sans Print" w:eastAsia="Anthropic Sans Print"/>
-                <w:b w:val="0"/>
-                <w:i w:val="0"/>
-                <w:color w:val="1F1E1D"/>
-                <w:sz w:val="20"/>
-              </w:rPr>
-              <w:t>un</w:t>
-            </w:r>
-          </w:p>
-        </w:tc>
-        <w:tc>
-          <w:tcPr>
-            <w:tcW w:type="dxa" w:w="1696"/>
-            <w:tcBorders>
-              <w:start w:sz="5.599999999999909" w:val="single" w:color="#E7E4DB"/>
-              <w:top w:sz="6.399999999999977" w:val="single" w:color="#E7E4DB"/>
-              <w:end w:sz="5.599999999999909" w:val="single" w:color="#E7E4DB"/>
-              <w:bottom w:sz="5.600000000000023" w:val="single" w:color="#E7E4DB"/>
-            </w:tcBorders>
-            <w:tcMar>
-              <w:start w:w="0" w:type="dxa"/>
-              <w:end w:w="0" w:type="dxa"/>
-            </w:tcMar>
-          </w:tcPr>
-          <w:p>
-            <w:pPr>
-              <w:autoSpaceDN w:val="0"/>
-              <w:autoSpaceDE w:val="0"/>
-              <w:widowControl/>
-              <w:spacing w:line="240" w:lineRule="auto" w:before="74" w:after="0"/>
-              <w:ind w:left="90" w:right="0" w:firstLine="0"/>
-              <w:jc w:val="left"/>
-            </w:pPr>
-            <w:r>
-              <w:rPr>
-                <w:w w:val="98.4000015258789"/>
-                <w:rFonts w:ascii="Anthropic Sans Print" w:hAnsi="Anthropic Sans Print" w:eastAsia="Anthropic Sans Print"/>
-                <w:b w:val="0"/>
-                <w:i w:val="0"/>
-                <w:color w:val="1F1E1D"/>
-                <w:sz w:val="20"/>
-              </w:rPr>
-              <w:t>195,79</w:t>
-            </w:r>
-          </w:p>
-        </w:tc>
-        <w:tc>
-          <w:tcPr>
-            <w:tcW w:type="dxa" w:w="1214"/>
-            <w:tcBorders>
-              <w:start w:sz="5.599999999999909" w:val="single" w:color="#E7E4DB"/>
-              <w:top w:sz="6.399999999999977" w:val="single" w:color="#E7E4DB"/>
-              <w:end w:sz="6.399999999999636" w:val="single" w:color="#E7E4DB"/>
-              <w:bottom w:sz="5.600000000000023" w:val="single" w:color="#E7E4DB"/>
-            </w:tcBorders>
-            <w:tcMar>
-              <w:start w:w="0" w:type="dxa"/>
-              <w:end w:w="0" w:type="dxa"/>
-            </w:tcMar>
-          </w:tcPr>
-          <w:p>
-            <w:pPr>
-              <w:autoSpaceDN w:val="0"/>
-              <w:autoSpaceDE w:val="0"/>
-              <w:widowControl/>
-              <w:spacing w:line="240" w:lineRule="auto" w:before="74" w:after="0"/>
-              <w:ind w:left="88" w:right="0" w:firstLine="0"/>
-              <w:jc w:val="left"/>
-            </w:pPr>
-            <w:r>
-              <w:rPr>
-                <w:w w:val="98.4000015258789"/>
-                <w:rFonts w:ascii="Anthropic Sans Print" w:hAnsi="Anthropic Sans Print" w:eastAsia="Anthropic Sans Print"/>
-                <w:b w:val="0"/>
-                <w:i w:val="0"/>
-                <w:color w:val="1F1E1D"/>
-                <w:sz w:val="20"/>
-              </w:rPr>
-              <w:t>1.674.004</w:t>
-            </w:r>
-          </w:p>
-        </w:tc>
-      </w:tr>
-      <w:tr>
-        <w:trPr>
-          <w:trHeight w:hRule="exact" w:val="708"/>
-        </w:trPr>
-        <w:tc>
-          <w:tcPr>
-            <w:tcW w:type="dxa" w:w="720"/>
-            <w:tcBorders>
-              <w:start w:sz="6.399999999999977" w:val="single" w:color="#E7E4DB"/>
-              <w:top w:sz="5.600000000000023" w:val="single" w:color="#E7E4DB"/>
-              <w:end w:sz="6.399999999999977" w:val="single" w:color="#E7E4DB"/>
-              <w:bottom w:sz="5.599999999999909" w:val="single" w:color="#E7E4DB"/>
-            </w:tcBorders>
-            <w:tcMar>
-              <w:start w:w="0" w:type="dxa"/>
-              <w:end w:w="0" w:type="dxa"/>
-            </w:tcMar>
-          </w:tcPr>
-          <w:p>
-            <w:pPr>
-              <w:autoSpaceDN w:val="0"/>
-              <w:autoSpaceDE w:val="0"/>
-              <w:widowControl/>
-              <w:spacing w:line="240" w:lineRule="auto" w:before="76" w:after="0"/>
-              <w:ind w:left="88" w:right="0" w:firstLine="0"/>
-              <w:jc w:val="left"/>
-            </w:pPr>
-            <w:r>
-              <w:rPr>
-                <w:w w:val="98.4000015258789"/>
-                <w:rFonts w:ascii="Anthropic Sans Print" w:hAnsi="Anthropic Sans Print" w:eastAsia="Anthropic Sans Print"/>
-                <w:b w:val="0"/>
-                <w:i w:val="0"/>
-                <w:color w:val="1F1E1D"/>
-                <w:sz w:val="20"/>
-              </w:rPr>
-              <w:t>3</w:t>
-            </w:r>
-          </w:p>
-        </w:tc>
-        <w:tc>
-          <w:tcPr>
-            <w:tcW w:type="dxa" w:w="4860"/>
-            <w:tcBorders>
-              <w:start w:sz="6.399999999999977" w:val="single" w:color="#E7E4DB"/>
-              <w:top w:sz="5.600000000000023" w:val="single" w:color="#E7E4DB"/>
-              <w:end w:sz="6.400000000000091" w:val="single" w:color="#E7E4DB"/>
-              <w:bottom w:sz="5.599999999999909" w:val="single" w:color="#E7E4DB"/>
-            </w:tcBorders>
-            <w:tcMar>
-              <w:start w:w="0" w:type="dxa"/>
-              <w:end w:w="0" w:type="dxa"/>
-            </w:tcMar>
-          </w:tcPr>
-          <w:p>
-            <w:pPr>
-              <w:autoSpaceDN w:val="0"/>
-              <w:autoSpaceDE w:val="0"/>
-              <w:widowControl/>
-              <w:spacing w:line="259" w:lineRule="auto" w:before="76" w:after="0"/>
-              <w:ind w:left="88" w:right="1152" w:firstLine="0"/>
-              <w:jc w:val="left"/>
-            </w:pPr>
-            <w:r>
-              <w:rPr>
-                <w:w w:val="98.4000015258789"/>
-                <w:rFonts w:ascii="Anthropic Sans Print" w:hAnsi="Anthropic Sans Print" w:eastAsia="Anthropic Sans Print"/>
-                <w:b w:val="0"/>
-                <w:i w:val="0"/>
-                <w:color w:val="1F1E1D"/>
-                <w:sz w:val="20"/>
-              </w:rPr>
-              <w:t xml:space="preserve">Lámpara LED miniatura de 72 Vcc para </w:t>
-            </w:r>
-            <w:r>
-              <w:rPr>
-                <w:w w:val="98.4000015258789"/>
-                <w:rFonts w:ascii="Anthropic Sans Print" w:hAnsi="Anthropic Sans Print" w:eastAsia="Anthropic Sans Print"/>
-                <w:b w:val="0"/>
-                <w:i w:val="0"/>
-                <w:color w:val="1F1E1D"/>
-                <w:sz w:val="20"/>
-              </w:rPr>
-              <w:t>instrumentos, 12 + 2 de repuesto</w:t>
-            </w:r>
-          </w:p>
-        </w:tc>
-        <w:tc>
-          <w:tcPr>
-            <w:tcW w:type="dxa" w:w="720"/>
-            <w:tcBorders>
-              <w:start w:sz="6.400000000000091" w:val="single" w:color="#E7E4DB"/>
-              <w:top w:sz="5.600000000000023" w:val="single" w:color="#E7E4DB"/>
-              <w:end w:sz="6.400000000000091" w:val="single" w:color="#E7E4DB"/>
-              <w:bottom w:sz="5.599999999999909" w:val="single" w:color="#E7E4DB"/>
-            </w:tcBorders>
-            <w:tcMar>
-              <w:start w:w="0" w:type="dxa"/>
-              <w:end w:w="0" w:type="dxa"/>
-            </w:tcMar>
-          </w:tcPr>
-          <w:p>
-            <w:pPr>
-              <w:autoSpaceDN w:val="0"/>
-              <w:autoSpaceDE w:val="0"/>
-              <w:widowControl/>
-              <w:spacing w:line="240" w:lineRule="auto" w:before="76" w:after="0"/>
-              <w:ind w:left="92" w:right="0" w:firstLine="0"/>
-              <w:jc w:val="left"/>
-            </w:pPr>
-            <w:r>
-              <w:rPr>
-                <w:w w:val="98.4000015258789"/>
-                <w:rFonts w:ascii="Anthropic Sans Print" w:hAnsi="Anthropic Sans Print" w:eastAsia="Anthropic Sans Print"/>
-                <w:b w:val="0"/>
-                <w:i w:val="0"/>
-                <w:color w:val="1F1E1D"/>
-                <w:sz w:val="20"/>
-              </w:rPr>
-              <w:t>14</w:t>
-            </w:r>
-          </w:p>
-        </w:tc>
-        <w:tc>
-          <w:tcPr>
-            <w:tcW w:type="dxa" w:w="854"/>
-            <w:tcBorders>
-              <w:start w:sz="6.400000000000091" w:val="single" w:color="#E7E4DB"/>
-              <w:top w:sz="5.600000000000023" w:val="single" w:color="#E7E4DB"/>
-              <w:end w:sz="5.599999999999909" w:val="single" w:color="#E7E4DB"/>
-              <w:bottom w:sz="5.599999999999909" w:val="single" w:color="#E7E4DB"/>
-            </w:tcBorders>
-            <w:tcMar>
-              <w:start w:w="0" w:type="dxa"/>
-              <w:end w:w="0" w:type="dxa"/>
-            </w:tcMar>
-          </w:tcPr>
-          <w:p>
-            <w:pPr>
-              <w:autoSpaceDN w:val="0"/>
-              <w:autoSpaceDE w:val="0"/>
-              <w:widowControl/>
-              <w:spacing w:line="240" w:lineRule="auto" w:before="76" w:after="0"/>
-              <w:ind w:left="92" w:right="0" w:firstLine="0"/>
-              <w:jc w:val="left"/>
-            </w:pPr>
-            <w:r>
-              <w:rPr>
-                <w:w w:val="98.4000015258789"/>
-                <w:rFonts w:ascii="Anthropic Sans Print" w:hAnsi="Anthropic Sans Print" w:eastAsia="Anthropic Sans Print"/>
-                <w:b w:val="0"/>
-                <w:i w:val="0"/>
-                <w:color w:val="1F1E1D"/>
-                <w:sz w:val="20"/>
-              </w:rPr>
-              <w:t>un</w:t>
-            </w:r>
-          </w:p>
-        </w:tc>
-        <w:tc>
-          <w:tcPr>
-            <w:tcW w:type="dxa" w:w="1696"/>
-            <w:tcBorders>
-              <w:start w:sz="5.599999999999909" w:val="single" w:color="#E7E4DB"/>
-              <w:top w:sz="5.600000000000023" w:val="single" w:color="#E7E4DB"/>
-              <w:end w:sz="5.599999999999909" w:val="single" w:color="#E7E4DB"/>
-              <w:bottom w:sz="5.599999999999909" w:val="single" w:color="#E7E4DB"/>
-            </w:tcBorders>
-            <w:tcMar>
-              <w:start w:w="0" w:type="dxa"/>
-              <w:end w:w="0" w:type="dxa"/>
-            </w:tcMar>
-          </w:tcPr>
-          <w:p>
-            <w:pPr>
-              <w:autoSpaceDN w:val="0"/>
-              <w:autoSpaceDE w:val="0"/>
-              <w:widowControl/>
-              <w:spacing w:line="240" w:lineRule="auto" w:before="76" w:after="0"/>
-              <w:ind w:left="90" w:right="0" w:firstLine="0"/>
-              <w:jc w:val="left"/>
-            </w:pPr>
-            <w:r>
-              <w:rPr>
-                <w:w w:val="98.4000015258789"/>
-                <w:rFonts w:ascii="Anthropic Sans Print" w:hAnsi="Anthropic Sans Print" w:eastAsia="Anthropic Sans Print"/>
-                <w:b w:val="0"/>
-                <w:i w:val="0"/>
-                <w:color w:val="1F1E1D"/>
-                <w:sz w:val="20"/>
-              </w:rPr>
-              <w:t>120,00</w:t>
-            </w:r>
-          </w:p>
-        </w:tc>
-        <w:tc>
-          <w:tcPr>
-            <w:tcW w:type="dxa" w:w="1214"/>
-            <w:tcBorders>
-              <w:start w:sz="5.599999999999909" w:val="single" w:color="#E7E4DB"/>
-              <w:top w:sz="5.600000000000023" w:val="single" w:color="#E7E4DB"/>
-              <w:end w:sz="6.399999999999636" w:val="single" w:color="#E7E4DB"/>
-              <w:bottom w:sz="5.599999999999909" w:val="single" w:color="#E7E4DB"/>
-            </w:tcBorders>
-            <w:tcMar>
-              <w:start w:w="0" w:type="dxa"/>
-              <w:end w:w="0" w:type="dxa"/>
-            </w:tcMar>
-          </w:tcPr>
-          <w:p>
-            <w:pPr>
-              <w:autoSpaceDN w:val="0"/>
-              <w:autoSpaceDE w:val="0"/>
-              <w:widowControl/>
-              <w:spacing w:line="240" w:lineRule="auto" w:before="76" w:after="0"/>
-              <w:ind w:left="88" w:right="0" w:firstLine="0"/>
-              <w:jc w:val="left"/>
-            </w:pPr>
-            <w:r>
-              <w:rPr>
-                <w:w w:val="98.4000015258789"/>
-                <w:rFonts w:ascii="Anthropic Sans Print" w:hAnsi="Anthropic Sans Print" w:eastAsia="Anthropic Sans Print"/>
-                <w:b w:val="0"/>
-                <w:i w:val="0"/>
-                <w:color w:val="1F1E1D"/>
-                <w:sz w:val="20"/>
-              </w:rPr>
-              <w:t>1.596.000</w:t>
-            </w:r>
-          </w:p>
-        </w:tc>
-      </w:tr>
-      <w:tr>
-        <w:trPr>
-          <w:trHeight w:hRule="exact" w:val="704"/>
-        </w:trPr>
-        <w:tc>
-          <w:tcPr>
-            <w:tcW w:type="dxa" w:w="720"/>
-            <w:tcBorders>
-              <w:start w:sz="6.399999999999977" w:val="single" w:color="#E7E4DB"/>
-              <w:top w:sz="5.599999999999909" w:val="single" w:color="#E7E4DB"/>
-              <w:end w:sz="6.399999999999977" w:val="single" w:color="#E7E4DB"/>
-              <w:bottom w:sz="6.400000000000091" w:val="single" w:color="#E7E4DB"/>
-            </w:tcBorders>
-            <w:tcMar>
-              <w:start w:w="0" w:type="dxa"/>
-              <w:end w:w="0" w:type="dxa"/>
-            </w:tcMar>
-          </w:tcPr>
-          <w:p>
-            <w:pPr>
-              <w:autoSpaceDN w:val="0"/>
-              <w:autoSpaceDE w:val="0"/>
-              <w:widowControl/>
-              <w:spacing w:line="240" w:lineRule="auto" w:before="74" w:after="0"/>
-              <w:ind w:left="88" w:right="0" w:firstLine="0"/>
-              <w:jc w:val="left"/>
-            </w:pPr>
-            <w:r>
-              <w:rPr>
-                <w:w w:val="98.4000015258789"/>
-                <w:rFonts w:ascii="Anthropic Sans Print" w:hAnsi="Anthropic Sans Print" w:eastAsia="Anthropic Sans Print"/>
-                <w:b w:val="0"/>
-                <w:i w:val="0"/>
-                <w:color w:val="1F1E1D"/>
-                <w:sz w:val="20"/>
-              </w:rPr>
-              <w:t>4</w:t>
-            </w:r>
-          </w:p>
-        </w:tc>
-        <w:tc>
-          <w:tcPr>
-            <w:tcW w:type="dxa" w:w="4860"/>
-            <w:tcBorders>
-              <w:start w:sz="6.399999999999977" w:val="single" w:color="#E7E4DB"/>
-              <w:top w:sz="5.599999999999909" w:val="single" w:color="#E7E4DB"/>
-              <w:end w:sz="6.400000000000091" w:val="single" w:color="#E7E4DB"/>
-              <w:bottom w:sz="6.400000000000091" w:val="single" w:color="#E7E4DB"/>
-            </w:tcBorders>
-            <w:tcMar>
-              <w:start w:w="0" w:type="dxa"/>
-              <w:end w:w="0" w:type="dxa"/>
-            </w:tcMar>
-          </w:tcPr>
-          <w:p>
-            <w:pPr>
-              <w:autoSpaceDN w:val="0"/>
-              <w:autoSpaceDE w:val="0"/>
-              <w:widowControl/>
-              <w:spacing w:line="259" w:lineRule="auto" w:before="74" w:after="0"/>
-              <w:ind w:left="88" w:right="288" w:firstLine="0"/>
-              <w:jc w:val="left"/>
-            </w:pPr>
-            <w:r>
-              <w:rPr>
-                <w:w w:val="98.4000015258789"/>
-                <w:rFonts w:ascii="Anthropic Sans Print" w:hAnsi="Anthropic Sans Print" w:eastAsia="Anthropic Sans Print"/>
-                <w:b w:val="0"/>
-                <w:i w:val="0"/>
-                <w:color w:val="1F1E1D"/>
-                <w:sz w:val="20"/>
-              </w:rPr>
-              <w:t xml:space="preserve">Diodo TVS bidireccional 5 kW, 110 V (5KP110CA o </w:t>
-            </w:r>
-            <w:r>
-              <w:rPr>
-                <w:w w:val="98.4000015258789"/>
-                <w:rFonts w:ascii="Anthropic Sans Print" w:hAnsi="Anthropic Sans Print" w:eastAsia="Anthropic Sans Print"/>
-                <w:b w:val="0"/>
-                <w:i w:val="0"/>
-                <w:color w:val="1F1E1D"/>
-                <w:sz w:val="20"/>
-              </w:rPr>
-              <w:t>equivalente), uno por circuito</w:t>
-            </w:r>
-          </w:p>
-        </w:tc>
-        <w:tc>
-          <w:tcPr>
-            <w:tcW w:type="dxa" w:w="720"/>
-            <w:tcBorders>
-              <w:start w:sz="6.400000000000091" w:val="single" w:color="#E7E4DB"/>
               <w:top w:sz="5.599999999999909" w:val="single" w:color="#E7E4DB"/>
               <w:end w:sz="6.400000000000091" w:val="single" w:color="#E7E4DB"/>
               <w:bottom w:sz="6.400000000000091" w:val="single" w:color="#E7E4DB"/>
@@ -6412,7 +5695,7 @@
                 <w:color w:val="1F1E1D"/>
                 <w:sz w:val="20"/>
               </w:rPr>
-              <w:t>20</w:t>
+              <w:t>9</w:t>
             </w:r>
           </w:p>
         </w:tc>
@@ -6484,7 +5767,7 @@
                 <w:color w:val="1F1E1D"/>
                 <w:sz w:val="20"/>
               </w:rPr>
-              <w:t>3,50</w:t>
+              <w:t>195,79</w:t>
             </w:r>
           </w:p>
         </w:tc>
@@ -6520,7 +5803,7 @@
                 <w:color w:val="1F1E1D"/>
                 <w:sz w:val="20"/>
               </w:rPr>
-              <w:t>66.500</w:t>
+              <w:t>1.674.004</w:t>
             </w:r>
           </w:p>
         </w:tc>
@@ -6561,7 +5844,7 @@
                 <w:color w:val="1F1E1D"/>
                 <w:sz w:val="20"/>
               </w:rPr>
-              <w:t>5</w:t>
+              <w:t>3</w:t>
             </w:r>
           </w:p>
         </w:tc>
@@ -6585,7 +5868,7 @@
               <w:autoSpaceDE w:val="0"/>
               <w:widowControl/>
               <w:spacing w:line="259" w:lineRule="auto" w:before="74" w:after="0"/>
-              <w:ind w:left="88" w:right="864" w:firstLine="0"/>
+              <w:ind w:left="88" w:right="1152" w:firstLine="0"/>
               <w:jc w:val="left"/>
             </w:pPr>
             <w:r>
@@ -6597,7 +5880,7 @@
                 <w:color w:val="1F1E1D"/>
                 <w:sz w:val="20"/>
               </w:rPr>
-              <w:t xml:space="preserve">Misceláneos: terminales, termorretráctil y </w:t>
+              <w:t xml:space="preserve">Lámpara LED miniatura de 72 Vcc para </w:t>
             </w:r>
             <w:r>
               <w:rPr>
@@ -6608,7 +5891,7 @@
                 <w:color w:val="1F1E1D"/>
                 <w:sz w:val="20"/>
               </w:rPr>
-              <w:t>abrazaderas</w:t>
+              <w:t>instrumentos, 12 + 2 de repuesto</w:t>
             </w:r>
           </w:p>
         </w:tc>
@@ -6644,7 +5927,7 @@
                 <w:color w:val="1F1E1D"/>
                 <w:sz w:val="20"/>
               </w:rPr>
-              <w:t>2</w:t>
+              <w:t>14</w:t>
             </w:r>
           </w:p>
         </w:tc>
@@ -6680,7 +5963,7 @@
                 <w:color w:val="1F1E1D"/>
                 <w:sz w:val="20"/>
               </w:rPr>
-              <w:t>lote</w:t>
+              <w:t>un</w:t>
             </w:r>
           </w:p>
         </w:tc>
@@ -6716,7 +5999,7 @@
                 <w:color w:val="1F1E1D"/>
                 <w:sz w:val="20"/>
               </w:rPr>
-              <w:t>40,00</w:t>
+              <w:t>120,00</w:t>
             </w:r>
           </w:p>
         </w:tc>
@@ -6752,6 +6035,470 @@
                 <w:color w:val="1F1E1D"/>
                 <w:sz w:val="20"/>
               </w:rPr>
+              <w:t>1.596.000</w:t>
+            </w:r>
+          </w:p>
+        </w:tc>
+      </w:tr>
+      <w:tr>
+        <w:trPr>
+          <w:trHeight w:hRule="exact" w:val="704"/>
+        </w:trPr>
+        <w:tc>
+          <w:tcPr>
+            <w:tcW w:type="dxa" w:w="720"/>
+            <w:tcBorders>
+              <w:start w:sz="6.399999999999977" w:val="single" w:color="#E7E4DB"/>
+              <w:top w:sz="6.400000000000091" w:val="single" w:color="#E7E4DB"/>
+              <w:end w:sz="6.399999999999977" w:val="single" w:color="#E7E4DB"/>
+              <w:bottom w:sz="5.599999999999909" w:val="single" w:color="#E7E4DB"/>
+            </w:tcBorders>
+            <w:tcMar>
+              <w:start w:w="0" w:type="dxa"/>
+              <w:end w:w="0" w:type="dxa"/>
+            </w:tcMar>
+          </w:tcPr>
+          <w:p>
+            <w:pPr>
+              <w:autoSpaceDN w:val="0"/>
+              <w:autoSpaceDE w:val="0"/>
+              <w:widowControl/>
+              <w:spacing w:line="240" w:lineRule="auto" w:before="74" w:after="0"/>
+              <w:ind w:left="88" w:right="0" w:firstLine="0"/>
+              <w:jc w:val="left"/>
+            </w:pPr>
+            <w:r>
+              <w:rPr>
+                <w:w w:val="98.4000015258789"/>
+                <w:rFonts w:ascii="Anthropic Sans Print" w:hAnsi="Anthropic Sans Print" w:eastAsia="Anthropic Sans Print"/>
+                <w:b w:val="0"/>
+                <w:i w:val="0"/>
+                <w:color w:val="1F1E1D"/>
+                <w:sz w:val="20"/>
+              </w:rPr>
+              <w:t>4</w:t>
+            </w:r>
+          </w:p>
+        </w:tc>
+        <w:tc>
+          <w:tcPr>
+            <w:tcW w:type="dxa" w:w="4860"/>
+            <w:tcBorders>
+              <w:start w:sz="6.399999999999977" w:val="single" w:color="#E7E4DB"/>
+              <w:top w:sz="6.400000000000091" w:val="single" w:color="#E7E4DB"/>
+              <w:end w:sz="6.400000000000091" w:val="single" w:color="#E7E4DB"/>
+              <w:bottom w:sz="5.599999999999909" w:val="single" w:color="#E7E4DB"/>
+            </w:tcBorders>
+            <w:tcMar>
+              <w:start w:w="0" w:type="dxa"/>
+              <w:end w:w="0" w:type="dxa"/>
+            </w:tcMar>
+          </w:tcPr>
+          <w:p>
+            <w:pPr>
+              <w:autoSpaceDN w:val="0"/>
+              <w:autoSpaceDE w:val="0"/>
+              <w:widowControl/>
+              <w:spacing w:line="259" w:lineRule="auto" w:before="74" w:after="0"/>
+              <w:ind w:left="88" w:right="288" w:firstLine="0"/>
+              <w:jc w:val="left"/>
+            </w:pPr>
+            <w:r>
+              <w:rPr>
+                <w:w w:val="98.4000015258789"/>
+                <w:rFonts w:ascii="Anthropic Sans Print" w:hAnsi="Anthropic Sans Print" w:eastAsia="Anthropic Sans Print"/>
+                <w:b w:val="0"/>
+                <w:i w:val="0"/>
+                <w:color w:val="1F1E1D"/>
+                <w:sz w:val="20"/>
+              </w:rPr>
+              <w:t xml:space="preserve">Diodo TVS bidireccional 5 kW, 110 V (5KP110CA o </w:t>
+            </w:r>
+            <w:r>
+              <w:rPr>
+                <w:w w:val="98.4000015258789"/>
+                <w:rFonts w:ascii="Anthropic Sans Print" w:hAnsi="Anthropic Sans Print" w:eastAsia="Anthropic Sans Print"/>
+                <w:b w:val="0"/>
+                <w:i w:val="0"/>
+                <w:color w:val="1F1E1D"/>
+                <w:sz w:val="20"/>
+              </w:rPr>
+              <w:t>equivalente), uno por circuito</w:t>
+            </w:r>
+          </w:p>
+        </w:tc>
+        <w:tc>
+          <w:tcPr>
+            <w:tcW w:type="dxa" w:w="720"/>
+            <w:tcBorders>
+              <w:start w:sz="6.400000000000091" w:val="single" w:color="#E7E4DB"/>
+              <w:top w:sz="6.400000000000091" w:val="single" w:color="#E7E4DB"/>
+              <w:end w:sz="6.400000000000091" w:val="single" w:color="#E7E4DB"/>
+              <w:bottom w:sz="5.599999999999909" w:val="single" w:color="#E7E4DB"/>
+            </w:tcBorders>
+            <w:tcMar>
+              <w:start w:w="0" w:type="dxa"/>
+              <w:end w:w="0" w:type="dxa"/>
+            </w:tcMar>
+          </w:tcPr>
+          <w:p>
+            <w:pPr>
+              <w:autoSpaceDN w:val="0"/>
+              <w:autoSpaceDE w:val="0"/>
+              <w:widowControl/>
+              <w:spacing w:line="240" w:lineRule="auto" w:before="74" w:after="0"/>
+              <w:ind w:left="92" w:right="0" w:firstLine="0"/>
+              <w:jc w:val="left"/>
+            </w:pPr>
+            <w:r>
+              <w:rPr>
+                <w:w w:val="98.4000015258789"/>
+                <w:rFonts w:ascii="Anthropic Sans Print" w:hAnsi="Anthropic Sans Print" w:eastAsia="Anthropic Sans Print"/>
+                <w:b w:val="0"/>
+                <w:i w:val="0"/>
+                <w:color w:val="1F1E1D"/>
+                <w:sz w:val="20"/>
+              </w:rPr>
+              <w:t>20</w:t>
+            </w:r>
+          </w:p>
+        </w:tc>
+        <w:tc>
+          <w:tcPr>
+            <w:tcW w:type="dxa" w:w="854"/>
+            <w:tcBorders>
+              <w:start w:sz="6.400000000000091" w:val="single" w:color="#E7E4DB"/>
+              <w:top w:sz="6.400000000000091" w:val="single" w:color="#E7E4DB"/>
+              <w:end w:sz="5.599999999999909" w:val="single" w:color="#E7E4DB"/>
+              <w:bottom w:sz="5.599999999999909" w:val="single" w:color="#E7E4DB"/>
+            </w:tcBorders>
+            <w:tcMar>
+              <w:start w:w="0" w:type="dxa"/>
+              <w:end w:w="0" w:type="dxa"/>
+            </w:tcMar>
+          </w:tcPr>
+          <w:p>
+            <w:pPr>
+              <w:autoSpaceDN w:val="0"/>
+              <w:autoSpaceDE w:val="0"/>
+              <w:widowControl/>
+              <w:spacing w:line="240" w:lineRule="auto" w:before="74" w:after="0"/>
+              <w:ind w:left="92" w:right="0" w:firstLine="0"/>
+              <w:jc w:val="left"/>
+            </w:pPr>
+            <w:r>
+              <w:rPr>
+                <w:w w:val="98.4000015258789"/>
+                <w:rFonts w:ascii="Anthropic Sans Print" w:hAnsi="Anthropic Sans Print" w:eastAsia="Anthropic Sans Print"/>
+                <w:b w:val="0"/>
+                <w:i w:val="0"/>
+                <w:color w:val="1F1E1D"/>
+                <w:sz w:val="20"/>
+              </w:rPr>
+              <w:t>un</w:t>
+            </w:r>
+          </w:p>
+        </w:tc>
+        <w:tc>
+          <w:tcPr>
+            <w:tcW w:type="dxa" w:w="1696"/>
+            <w:tcBorders>
+              <w:start w:sz="5.599999999999909" w:val="single" w:color="#E7E4DB"/>
+              <w:top w:sz="6.400000000000091" w:val="single" w:color="#E7E4DB"/>
+              <w:end w:sz="5.599999999999909" w:val="single" w:color="#E7E4DB"/>
+              <w:bottom w:sz="5.599999999999909" w:val="single" w:color="#E7E4DB"/>
+            </w:tcBorders>
+            <w:tcMar>
+              <w:start w:w="0" w:type="dxa"/>
+              <w:end w:w="0" w:type="dxa"/>
+            </w:tcMar>
+          </w:tcPr>
+          <w:p>
+            <w:pPr>
+              <w:autoSpaceDN w:val="0"/>
+              <w:autoSpaceDE w:val="0"/>
+              <w:widowControl/>
+              <w:spacing w:line="240" w:lineRule="auto" w:before="74" w:after="0"/>
+              <w:ind w:left="90" w:right="0" w:firstLine="0"/>
+              <w:jc w:val="left"/>
+            </w:pPr>
+            <w:r>
+              <w:rPr>
+                <w:w w:val="98.4000015258789"/>
+                <w:rFonts w:ascii="Anthropic Sans Print" w:hAnsi="Anthropic Sans Print" w:eastAsia="Anthropic Sans Print"/>
+                <w:b w:val="0"/>
+                <w:i w:val="0"/>
+                <w:color w:val="1F1E1D"/>
+                <w:sz w:val="20"/>
+              </w:rPr>
+              <w:t>3,50</w:t>
+            </w:r>
+          </w:p>
+        </w:tc>
+        <w:tc>
+          <w:tcPr>
+            <w:tcW w:type="dxa" w:w="1214"/>
+            <w:tcBorders>
+              <w:start w:sz="5.599999999999909" w:val="single" w:color="#E7E4DB"/>
+              <w:top w:sz="6.400000000000091" w:val="single" w:color="#E7E4DB"/>
+              <w:end w:sz="6.399999999999636" w:val="single" w:color="#E7E4DB"/>
+              <w:bottom w:sz="5.599999999999909" w:val="single" w:color="#E7E4DB"/>
+            </w:tcBorders>
+            <w:tcMar>
+              <w:start w:w="0" w:type="dxa"/>
+              <w:end w:w="0" w:type="dxa"/>
+            </w:tcMar>
+          </w:tcPr>
+          <w:p>
+            <w:pPr>
+              <w:autoSpaceDN w:val="0"/>
+              <w:autoSpaceDE w:val="0"/>
+              <w:widowControl/>
+              <w:spacing w:line="240" w:lineRule="auto" w:before="74" w:after="0"/>
+              <w:ind w:left="88" w:right="0" w:firstLine="0"/>
+              <w:jc w:val="left"/>
+            </w:pPr>
+            <w:r>
+              <w:rPr>
+                <w:w w:val="98.4000015258789"/>
+                <w:rFonts w:ascii="Anthropic Sans Print" w:hAnsi="Anthropic Sans Print" w:eastAsia="Anthropic Sans Print"/>
+                <w:b w:val="0"/>
+                <w:i w:val="0"/>
+                <w:color w:val="1F1E1D"/>
+                <w:sz w:val="20"/>
+              </w:rPr>
+              <w:t>66.500</w:t>
+            </w:r>
+          </w:p>
+        </w:tc>
+      </w:tr>
+      <w:tr>
+        <w:trPr>
+          <w:trHeight w:hRule="exact" w:val="706"/>
+        </w:trPr>
+        <w:tc>
+          <w:tcPr>
+            <w:tcW w:type="dxa" w:w="720"/>
+            <w:tcBorders>
+              <w:start w:sz="6.399999999999977" w:val="single" w:color="#E7E4DB"/>
+              <w:top w:sz="5.599999999999909" w:val="single" w:color="#E7E4DB"/>
+              <w:end w:sz="6.399999999999977" w:val="single" w:color="#E7E4DB"/>
+              <w:bottom w:sz="5.599999999999909" w:val="single" w:color="#E7E4DB"/>
+            </w:tcBorders>
+            <w:tcMar>
+              <w:start w:w="0" w:type="dxa"/>
+              <w:end w:w="0" w:type="dxa"/>
+            </w:tcMar>
+          </w:tcPr>
+          <w:p>
+            <w:pPr>
+              <w:autoSpaceDN w:val="0"/>
+              <w:autoSpaceDE w:val="0"/>
+              <w:widowControl/>
+              <w:spacing w:line="240" w:lineRule="auto" w:before="76" w:after="0"/>
+              <w:ind w:left="88" w:right="0" w:firstLine="0"/>
+              <w:jc w:val="left"/>
+            </w:pPr>
+            <w:r>
+              <w:rPr>
+                <w:w w:val="98.4000015258789"/>
+                <w:rFonts w:ascii="Anthropic Sans Print" w:hAnsi="Anthropic Sans Print" w:eastAsia="Anthropic Sans Print"/>
+                <w:b w:val="0"/>
+                <w:i w:val="0"/>
+                <w:color w:val="1F1E1D"/>
+                <w:sz w:val="20"/>
+              </w:rPr>
+              <w:t>5</w:t>
+            </w:r>
+          </w:p>
+        </w:tc>
+        <w:tc>
+          <w:tcPr>
+            <w:tcW w:type="dxa" w:w="4860"/>
+            <w:tcBorders>
+              <w:start w:sz="6.399999999999977" w:val="single" w:color="#E7E4DB"/>
+              <w:top w:sz="5.599999999999909" w:val="single" w:color="#E7E4DB"/>
+              <w:end w:sz="6.400000000000091" w:val="single" w:color="#E7E4DB"/>
+              <w:bottom w:sz="5.599999999999909" w:val="single" w:color="#E7E4DB"/>
+            </w:tcBorders>
+            <w:tcMar>
+              <w:start w:w="0" w:type="dxa"/>
+              <w:end w:w="0" w:type="dxa"/>
+            </w:tcMar>
+          </w:tcPr>
+          <w:p>
+            <w:pPr>
+              <w:autoSpaceDN w:val="0"/>
+              <w:autoSpaceDE w:val="0"/>
+              <w:widowControl/>
+              <w:spacing w:line="259" w:lineRule="auto" w:before="76" w:after="0"/>
+              <w:ind w:left="88" w:right="864" w:firstLine="0"/>
+              <w:jc w:val="left"/>
+            </w:pPr>
+            <w:r>
+              <w:rPr>
+                <w:w w:val="98.4000015258789"/>
+                <w:rFonts w:ascii="Anthropic Sans Print" w:hAnsi="Anthropic Sans Print" w:eastAsia="Anthropic Sans Print"/>
+                <w:b w:val="0"/>
+                <w:i w:val="0"/>
+                <w:color w:val="1F1E1D"/>
+                <w:sz w:val="20"/>
+              </w:rPr>
+              <w:t xml:space="preserve">Misceláneos: terminales, termorretráctil y </w:t>
+            </w:r>
+            <w:r>
+              <w:rPr>
+                <w:w w:val="98.4000015258789"/>
+                <w:rFonts w:ascii="Anthropic Sans Print" w:hAnsi="Anthropic Sans Print" w:eastAsia="Anthropic Sans Print"/>
+                <w:b w:val="0"/>
+                <w:i w:val="0"/>
+                <w:color w:val="1F1E1D"/>
+                <w:sz w:val="20"/>
+              </w:rPr>
+              <w:t>abrazaderas</w:t>
+            </w:r>
+          </w:p>
+        </w:tc>
+        <w:tc>
+          <w:tcPr>
+            <w:tcW w:type="dxa" w:w="720"/>
+            <w:tcBorders>
+              <w:start w:sz="6.400000000000091" w:val="single" w:color="#E7E4DB"/>
+              <w:top w:sz="5.599999999999909" w:val="single" w:color="#E7E4DB"/>
+              <w:end w:sz="6.400000000000091" w:val="single" w:color="#E7E4DB"/>
+              <w:bottom w:sz="5.599999999999909" w:val="single" w:color="#E7E4DB"/>
+            </w:tcBorders>
+            <w:tcMar>
+              <w:start w:w="0" w:type="dxa"/>
+              <w:end w:w="0" w:type="dxa"/>
+            </w:tcMar>
+          </w:tcPr>
+          <w:p>
+            <w:pPr>
+              <w:autoSpaceDN w:val="0"/>
+              <w:autoSpaceDE w:val="0"/>
+              <w:widowControl/>
+              <w:spacing w:line="240" w:lineRule="auto" w:before="76" w:after="0"/>
+              <w:ind w:left="92" w:right="0" w:firstLine="0"/>
+              <w:jc w:val="left"/>
+            </w:pPr>
+            <w:r>
+              <w:rPr>
+                <w:w w:val="98.4000015258789"/>
+                <w:rFonts w:ascii="Anthropic Sans Print" w:hAnsi="Anthropic Sans Print" w:eastAsia="Anthropic Sans Print"/>
+                <w:b w:val="0"/>
+                <w:i w:val="0"/>
+                <w:color w:val="1F1E1D"/>
+                <w:sz w:val="20"/>
+              </w:rPr>
+              <w:t>2</w:t>
+            </w:r>
+          </w:p>
+        </w:tc>
+        <w:tc>
+          <w:tcPr>
+            <w:tcW w:type="dxa" w:w="854"/>
+            <w:tcBorders>
+              <w:start w:sz="6.400000000000091" w:val="single" w:color="#E7E4DB"/>
+              <w:top w:sz="5.599999999999909" w:val="single" w:color="#E7E4DB"/>
+              <w:end w:sz="5.599999999999909" w:val="single" w:color="#E7E4DB"/>
+              <w:bottom w:sz="5.599999999999909" w:val="single" w:color="#E7E4DB"/>
+            </w:tcBorders>
+            <w:tcMar>
+              <w:start w:w="0" w:type="dxa"/>
+              <w:end w:w="0" w:type="dxa"/>
+            </w:tcMar>
+          </w:tcPr>
+          <w:p>
+            <w:pPr>
+              <w:autoSpaceDN w:val="0"/>
+              <w:autoSpaceDE w:val="0"/>
+              <w:widowControl/>
+              <w:spacing w:line="240" w:lineRule="auto" w:before="76" w:after="0"/>
+              <w:ind w:left="92" w:right="0" w:firstLine="0"/>
+              <w:jc w:val="left"/>
+            </w:pPr>
+            <w:r>
+              <w:rPr>
+                <w:w w:val="98.4000015258789"/>
+                <w:rFonts w:ascii="Anthropic Sans Print" w:hAnsi="Anthropic Sans Print" w:eastAsia="Anthropic Sans Print"/>
+                <w:b w:val="0"/>
+                <w:i w:val="0"/>
+                <w:color w:val="1F1E1D"/>
+                <w:sz w:val="20"/>
+              </w:rPr>
+              <w:t>lote</w:t>
+            </w:r>
+          </w:p>
+        </w:tc>
+        <w:tc>
+          <w:tcPr>
+            <w:tcW w:type="dxa" w:w="1696"/>
+            <w:tcBorders>
+              <w:start w:sz="5.599999999999909" w:val="single" w:color="#E7E4DB"/>
+              <w:top w:sz="5.599999999999909" w:val="single" w:color="#E7E4DB"/>
+              <w:end w:sz="5.599999999999909" w:val="single" w:color="#E7E4DB"/>
+              <w:bottom w:sz="5.599999999999909" w:val="single" w:color="#E7E4DB"/>
+            </w:tcBorders>
+            <w:tcMar>
+              <w:start w:w="0" w:type="dxa"/>
+              <w:end w:w="0" w:type="dxa"/>
+            </w:tcMar>
+          </w:tcPr>
+          <w:p>
+            <w:pPr>
+              <w:autoSpaceDN w:val="0"/>
+              <w:autoSpaceDE w:val="0"/>
+              <w:widowControl/>
+              <w:spacing w:line="240" w:lineRule="auto" w:before="76" w:after="0"/>
+              <w:ind w:left="90" w:right="0" w:firstLine="0"/>
+              <w:jc w:val="left"/>
+            </w:pPr>
+            <w:r>
+              <w:rPr>
+                <w:w w:val="98.4000015258789"/>
+                <w:rFonts w:ascii="Anthropic Sans Print" w:hAnsi="Anthropic Sans Print" w:eastAsia="Anthropic Sans Print"/>
+                <w:b w:val="0"/>
+                <w:i w:val="0"/>
+                <w:color w:val="1F1E1D"/>
+                <w:sz w:val="20"/>
+              </w:rPr>
+              <w:t>40,00</w:t>
+            </w:r>
+          </w:p>
+        </w:tc>
+        <w:tc>
+          <w:tcPr>
+            <w:tcW w:type="dxa" w:w="1214"/>
+            <w:tcBorders>
+              <w:start w:sz="5.599999999999909" w:val="single" w:color="#E7E4DB"/>
+              <w:top w:sz="5.599999999999909" w:val="single" w:color="#E7E4DB"/>
+              <w:end w:sz="6.399999999999636" w:val="single" w:color="#E7E4DB"/>
+              <w:bottom w:sz="5.599999999999909" w:val="single" w:color="#E7E4DB"/>
+            </w:tcBorders>
+            <w:tcMar>
+              <w:start w:w="0" w:type="dxa"/>
+              <w:end w:w="0" w:type="dxa"/>
+            </w:tcMar>
+          </w:tcPr>
+          <w:p>
+            <w:pPr>
+              <w:autoSpaceDN w:val="0"/>
+              <w:autoSpaceDE w:val="0"/>
+              <w:widowControl/>
+              <w:spacing w:line="240" w:lineRule="auto" w:before="76" w:after="0"/>
+              <w:ind w:left="88" w:right="0" w:firstLine="0"/>
+              <w:jc w:val="left"/>
+            </w:pPr>
+            <w:r>
+              <w:rPr>
+                <w:w w:val="98.4000015258789"/>
+                <w:rFonts w:ascii="Anthropic Sans Print" w:hAnsi="Anthropic Sans Print" w:eastAsia="Anthropic Sans Print"/>
+                <w:b w:val="0"/>
+                <w:i w:val="0"/>
+                <w:color w:val="1F1E1D"/>
+                <w:sz w:val="20"/>
+              </w:rPr>
               <w:t>76.000</w:t>
             </w:r>
           </w:p>
@@ -6766,9 +6513,9 @@
             <w:tcW w:type="dxa" w:w="720"/>
             <w:tcBorders>
               <w:start w:sz="6.399999999999977" w:val="single" w:color="#E7E4DB"/>
-              <w:top w:sz="6.400000000000091" w:val="single" w:color="#E7E4DB"/>
+              <w:top w:sz="5.599999999999909" w:val="single" w:color="#E7E4DB"/>
               <w:end w:sz="6.399999999999977" w:val="single" w:color="#E7E4DB"/>
-              <w:bottom w:sz="6.400000000000091" w:val="single" w:color="#E7E4DB"/>
+              <w:bottom w:sz="5.599999999999909" w:val="single" w:color="#E7E4DB"/>
             </w:tcBorders>
             <w:tcMar>
               <w:start w:w="0" w:type="dxa"/>
@@ -6782,9 +6529,9 @@
             <w:tcW w:type="dxa" w:w="4860"/>
             <w:tcBorders>
               <w:start w:sz="6.399999999999977" w:val="single" w:color="#E7E4DB"/>
-              <w:top w:sz="6.400000000000091" w:val="single" w:color="#E7E4DB"/>
+              <w:top w:sz="5.599999999999909" w:val="single" w:color="#E7E4DB"/>
               <w:end w:sz="6.400000000000091" w:val="single" w:color="#E7E4DB"/>
-              <w:bottom w:sz="6.400000000000091" w:val="single" w:color="#E7E4DB"/>
+              <w:bottom w:sz="5.599999999999909" w:val="single" w:color="#E7E4DB"/>
             </w:tcBorders>
             <w:tcMar>
               <w:start w:w="0" w:type="dxa"/>
@@ -6818,9 +6565,9 @@
             <w:tcW w:type="dxa" w:w="720"/>
             <w:tcBorders>
               <w:start w:sz="6.400000000000091" w:val="single" w:color="#E7E4DB"/>
-              <w:top w:sz="6.400000000000091" w:val="single" w:color="#E7E4DB"/>
+              <w:top w:sz="5.599999999999909" w:val="single" w:color="#E7E4DB"/>
               <w:end w:sz="6.400000000000091" w:val="single" w:color="#E7E4DB"/>
-              <w:bottom w:sz="6.400000000000091" w:val="single" w:color="#E7E4DB"/>
+              <w:bottom w:sz="5.599999999999909" w:val="single" w:color="#E7E4DB"/>
             </w:tcBorders>
             <w:tcMar>
               <w:start w:w="0" w:type="dxa"/>
@@ -6834,9 +6581,9 @@
             <w:tcW w:type="dxa" w:w="854"/>
             <w:tcBorders>
               <w:start w:sz="6.400000000000091" w:val="single" w:color="#E7E4DB"/>
-              <w:top w:sz="6.400000000000091" w:val="single" w:color="#E7E4DB"/>
+              <w:top w:sz="5.599999999999909" w:val="single" w:color="#E7E4DB"/>
               <w:end w:sz="5.599999999999909" w:val="single" w:color="#E7E4DB"/>
-              <w:bottom w:sz="6.400000000000091" w:val="single" w:color="#E7E4DB"/>
+              <w:bottom w:sz="5.599999999999909" w:val="single" w:color="#E7E4DB"/>
             </w:tcBorders>
             <w:tcMar>
               <w:start w:w="0" w:type="dxa"/>
@@ -6850,9 +6597,9 @@
             <w:tcW w:type="dxa" w:w="1696"/>
             <w:tcBorders>
               <w:start w:sz="5.599999999999909" w:val="single" w:color="#E7E4DB"/>
-              <w:top w:sz="6.400000000000091" w:val="single" w:color="#E7E4DB"/>
+              <w:top w:sz="5.599999999999909" w:val="single" w:color="#E7E4DB"/>
               <w:end w:sz="5.599999999999909" w:val="single" w:color="#E7E4DB"/>
-              <w:bottom w:sz="6.400000000000091" w:val="single" w:color="#E7E4DB"/>
+              <w:bottom w:sz="5.599999999999909" w:val="single" w:color="#E7E4DB"/>
             </w:tcBorders>
             <w:tcMar>
               <w:start w:w="0" w:type="dxa"/>
@@ -6866,9 +6613,9 @@
             <w:tcW w:type="dxa" w:w="1214"/>
             <w:tcBorders>
               <w:start w:sz="5.599999999999909" w:val="single" w:color="#E7E4DB"/>
-              <w:top w:sz="6.400000000000091" w:val="single" w:color="#E7E4DB"/>
+              <w:top w:sz="5.599999999999909" w:val="single" w:color="#E7E4DB"/>
               <w:end w:sz="6.399999999999636" w:val="single" w:color="#E7E4DB"/>
-              <w:bottom w:sz="6.400000000000091" w:val="single" w:color="#E7E4DB"/>
+              <w:bottom w:sz="5.599999999999909" w:val="single" w:color="#E7E4DB"/>
             </w:tcBorders>
             <w:tcMar>
               <w:start w:w="0" w:type="dxa"/>
@@ -6907,9 +6654,9 @@
             <w:tcW w:type="dxa" w:w="720"/>
             <w:tcBorders>
               <w:start w:sz="6.399999999999977" w:val="single" w:color="#E7E4DB"/>
-              <w:top w:sz="6.400000000000091" w:val="single" w:color="#E7E4DB"/>
+              <w:top w:sz="5.599999999999909" w:val="single" w:color="#E7E4DB"/>
               <w:end w:sz="6.399999999999977" w:val="single" w:color="#E7E4DB"/>
-              <w:bottom w:sz="6.400000000000091" w:val="single" w:color="#E7E4DB"/>
+              <w:bottom w:sz="5.599999999999909" w:val="single" w:color="#E7E4DB"/>
             </w:tcBorders>
             <w:tcMar>
               <w:start w:w="0" w:type="dxa"/>
@@ -6923,9 +6670,9 @@
             <w:tcW w:type="dxa" w:w="4860"/>
             <w:tcBorders>
               <w:start w:sz="6.399999999999977" w:val="single" w:color="#E7E4DB"/>
-              <w:top w:sz="6.400000000000091" w:val="single" w:color="#E7E4DB"/>
+              <w:top w:sz="5.599999999999909" w:val="single" w:color="#E7E4DB"/>
               <w:end w:sz="6.400000000000091" w:val="single" w:color="#E7E4DB"/>
-              <w:bottom w:sz="6.400000000000091" w:val="single" w:color="#E7E4DB"/>
+              <w:bottom w:sz="5.599999999999909" w:val="single" w:color="#E7E4DB"/>
             </w:tcBorders>
             <w:tcMar>
               <w:start w:w="0" w:type="dxa"/>
@@ -6959,9 +6706,9 @@
             <w:tcW w:type="dxa" w:w="720"/>
             <w:tcBorders>
               <w:start w:sz="6.400000000000091" w:val="single" w:color="#E7E4DB"/>
-              <w:top w:sz="6.400000000000091" w:val="single" w:color="#E7E4DB"/>
+              <w:top w:sz="5.599999999999909" w:val="single" w:color="#E7E4DB"/>
               <w:end w:sz="6.400000000000091" w:val="single" w:color="#E7E4DB"/>
-              <w:bottom w:sz="6.400000000000091" w:val="single" w:color="#E7E4DB"/>
+              <w:bottom w:sz="5.599999999999909" w:val="single" w:color="#E7E4DB"/>
             </w:tcBorders>
             <w:tcMar>
               <w:start w:w="0" w:type="dxa"/>
@@ -6975,9 +6722,9 @@
             <w:tcW w:type="dxa" w:w="854"/>
             <w:tcBorders>
               <w:start w:sz="6.400000000000091" w:val="single" w:color="#E7E4DB"/>
-              <w:top w:sz="6.400000000000091" w:val="single" w:color="#E7E4DB"/>
+              <w:top w:sz="5.599999999999909" w:val="single" w:color="#E7E4DB"/>
               <w:end w:sz="5.599999999999909" w:val="single" w:color="#E7E4DB"/>
-              <w:bottom w:sz="6.400000000000091" w:val="single" w:color="#E7E4DB"/>
+              <w:bottom w:sz="5.599999999999909" w:val="single" w:color="#E7E4DB"/>
             </w:tcBorders>
             <w:tcMar>
               <w:start w:w="0" w:type="dxa"/>
@@ -6991,9 +6738,9 @@
             <w:tcW w:type="dxa" w:w="1696"/>
             <w:tcBorders>
               <w:start w:sz="5.599999999999909" w:val="single" w:color="#E7E4DB"/>
-              <w:top w:sz="6.400000000000091" w:val="single" w:color="#E7E4DB"/>
+              <w:top w:sz="5.599999999999909" w:val="single" w:color="#E7E4DB"/>
               <w:end w:sz="5.599999999999909" w:val="single" w:color="#E7E4DB"/>
-              <w:bottom w:sz="6.400000000000091" w:val="single" w:color="#E7E4DB"/>
+              <w:bottom w:sz="5.599999999999909" w:val="single" w:color="#E7E4DB"/>
             </w:tcBorders>
             <w:tcMar>
               <w:start w:w="0" w:type="dxa"/>
@@ -7007,9 +6754,9 @@
             <w:tcW w:type="dxa" w:w="1214"/>
             <w:tcBorders>
               <w:start w:sz="5.599999999999909" w:val="single" w:color="#E7E4DB"/>
-              <w:top w:sz="6.400000000000091" w:val="single" w:color="#E7E4DB"/>
+              <w:top w:sz="5.599999999999909" w:val="single" w:color="#E7E4DB"/>
               <w:end w:sz="6.399999999999636" w:val="single" w:color="#E7E4DB"/>
-              <w:bottom w:sz="6.400000000000091" w:val="single" w:color="#E7E4DB"/>
+              <w:bottom w:sz="5.599999999999909" w:val="single" w:color="#E7E4DB"/>
             </w:tcBorders>
             <w:tcMar>
               <w:start w:w="0" w:type="dxa"/>
@@ -7041,16 +6788,16 @@
       </w:tr>
       <w:tr>
         <w:trPr>
-          <w:trHeight w:hRule="exact" w:val="420"/>
+          <w:trHeight w:hRule="exact" w:val="436"/>
         </w:trPr>
         <w:tc>
           <w:tcPr>
             <w:tcW w:type="dxa" w:w="720"/>
             <w:tcBorders>
               <w:start w:sz="6.399999999999977" w:val="single" w:color="#E7E4DB"/>
-              <w:top w:sz="6.400000000000091" w:val="single" w:color="#E7E4DB"/>
+              <w:top w:sz="5.599999999999909" w:val="single" w:color="#E7E4DB"/>
               <w:end w:sz="6.399999999999977" w:val="single" w:color="#E7E4DB"/>
-              <w:bottom w:sz="6.400000000000091" w:val="single" w:color="#E7E4DB"/>
+              <w:bottom w:sz="5.599999999999909" w:val="single" w:color="#E7E4DB"/>
             </w:tcBorders>
             <w:tcMar>
               <w:start w:w="0" w:type="dxa"/>
@@ -7064,9 +6811,9 @@
             <w:tcW w:type="dxa" w:w="4860"/>
             <w:tcBorders>
               <w:start w:sz="6.399999999999977" w:val="single" w:color="#E7E4DB"/>
-              <w:top w:sz="6.400000000000091" w:val="single" w:color="#E7E4DB"/>
+              <w:top w:sz="5.599999999999909" w:val="single" w:color="#E7E4DB"/>
               <w:end w:sz="6.400000000000091" w:val="single" w:color="#E7E4DB"/>
-              <w:bottom w:sz="6.400000000000091" w:val="single" w:color="#E7E4DB"/>
+              <w:bottom w:sz="5.599999999999909" w:val="single" w:color="#E7E4DB"/>
             </w:tcBorders>
             <w:tcMar>
               <w:start w:w="0" w:type="dxa"/>
@@ -7100,9 +6847,9 @@
             <w:tcW w:type="dxa" w:w="720"/>
             <w:tcBorders>
               <w:start w:sz="6.400000000000091" w:val="single" w:color="#E7E4DB"/>
-              <w:top w:sz="6.400000000000091" w:val="single" w:color="#E7E4DB"/>
+              <w:top w:sz="5.599999999999909" w:val="single" w:color="#E7E4DB"/>
               <w:end w:sz="6.400000000000091" w:val="single" w:color="#E7E4DB"/>
-              <w:bottom w:sz="6.400000000000091" w:val="single" w:color="#E7E4DB"/>
+              <w:bottom w:sz="5.599999999999909" w:val="single" w:color="#E7E4DB"/>
             </w:tcBorders>
             <w:tcMar>
               <w:start w:w="0" w:type="dxa"/>
@@ -7116,9 +6863,9 @@
             <w:tcW w:type="dxa" w:w="854"/>
             <w:tcBorders>
               <w:start w:sz="6.400000000000091" w:val="single" w:color="#E7E4DB"/>
-              <w:top w:sz="6.400000000000091" w:val="single" w:color="#E7E4DB"/>
+              <w:top w:sz="5.599999999999909" w:val="single" w:color="#E7E4DB"/>
               <w:end w:sz="5.599999999999909" w:val="single" w:color="#E7E4DB"/>
-              <w:bottom w:sz="6.400000000000091" w:val="single" w:color="#E7E4DB"/>
+              <w:bottom w:sz="5.599999999999909" w:val="single" w:color="#E7E4DB"/>
             </w:tcBorders>
             <w:tcMar>
               <w:start w:w="0" w:type="dxa"/>
@@ -7132,9 +6879,9 @@
             <w:tcW w:type="dxa" w:w="1696"/>
             <w:tcBorders>
               <w:start w:sz="5.599999999999909" w:val="single" w:color="#E7E4DB"/>
-              <w:top w:sz="6.400000000000091" w:val="single" w:color="#E7E4DB"/>
+              <w:top w:sz="5.599999999999909" w:val="single" w:color="#E7E4DB"/>
               <w:end w:sz="5.599999999999909" w:val="single" w:color="#E7E4DB"/>
-              <w:bottom w:sz="6.400000000000091" w:val="single" w:color="#E7E4DB"/>
+              <w:bottom w:sz="5.599999999999909" w:val="single" w:color="#E7E4DB"/>
             </w:tcBorders>
             <w:tcMar>
               <w:start w:w="0" w:type="dxa"/>
@@ -7148,9 +6895,9 @@
             <w:tcW w:type="dxa" w:w="1214"/>
             <w:tcBorders>
               <w:start w:sz="5.599999999999909" w:val="single" w:color="#E7E4DB"/>
-              <w:top w:sz="6.400000000000091" w:val="single" w:color="#E7E4DB"/>
+              <w:top w:sz="5.599999999999909" w:val="single" w:color="#E7E4DB"/>
               <w:end w:sz="6.399999999999636" w:val="single" w:color="#E7E4DB"/>
-              <w:bottom w:sz="6.400000000000091" w:val="single" w:color="#E7E4DB"/>
+              <w:bottom w:sz="5.599999999999909" w:val="single" w:color="#E7E4DB"/>
             </w:tcBorders>
             <w:tcMar>
               <w:start w:w="0" w:type="dxa"/>
@@ -7189,9 +6936,9 @@
             <w:tcW w:type="dxa" w:w="720"/>
             <w:tcBorders>
               <w:start w:sz="6.399999999999977" w:val="single" w:color="#E7E4DB"/>
-              <w:top w:sz="6.400000000000091" w:val="single" w:color="#E7E4DB"/>
+              <w:top w:sz="5.599999999999909" w:val="single" w:color="#E7E4DB"/>
               <w:end w:sz="6.399999999999977" w:val="single" w:color="#E7E4DB"/>
-              <w:bottom w:sz="6.400000000000091" w:val="single" w:color="#E7E4DB"/>
+              <w:bottom w:sz="5.599999999999909" w:val="single" w:color="#E7E4DB"/>
             </w:tcBorders>
             <w:tcMar>
               <w:start w:w="0" w:type="dxa"/>
@@ -7205,9 +6952,9 @@
             <w:tcW w:type="dxa" w:w="4860"/>
             <w:tcBorders>
               <w:start w:sz="6.399999999999977" w:val="single" w:color="#E7E4DB"/>
-              <w:top w:sz="6.400000000000091" w:val="single" w:color="#E7E4DB"/>
+              <w:top w:sz="5.599999999999909" w:val="single" w:color="#E7E4DB"/>
               <w:end w:sz="6.400000000000091" w:val="single" w:color="#E7E4DB"/>
-              <w:bottom w:sz="6.400000000000091" w:val="single" w:color="#E7E4DB"/>
+              <w:bottom w:sz="5.599999999999909" w:val="single" w:color="#E7E4DB"/>
             </w:tcBorders>
             <w:tcMar>
               <w:start w:w="0" w:type="dxa"/>
@@ -7219,7 +6966,7 @@
               <w:autoSpaceDN w:val="0"/>
               <w:autoSpaceDE w:val="0"/>
               <w:widowControl/>
-              <w:spacing w:line="240" w:lineRule="auto" w:before="74" w:after="0"/>
+              <w:spacing w:line="240" w:lineRule="auto" w:before="76" w:after="0"/>
               <w:ind w:left="88" w:right="0" w:firstLine="0"/>
               <w:jc w:val="left"/>
             </w:pPr>
@@ -7241,9 +6988,9 @@
             <w:tcW w:type="dxa" w:w="720"/>
             <w:tcBorders>
               <w:start w:sz="6.400000000000091" w:val="single" w:color="#E7E4DB"/>
-              <w:top w:sz="6.400000000000091" w:val="single" w:color="#E7E4DB"/>
+              <w:top w:sz="5.599999999999909" w:val="single" w:color="#E7E4DB"/>
               <w:end w:sz="6.400000000000091" w:val="single" w:color="#E7E4DB"/>
-              <w:bottom w:sz="6.400000000000091" w:val="single" w:color="#E7E4DB"/>
+              <w:bottom w:sz="5.599999999999909" w:val="single" w:color="#E7E4DB"/>
             </w:tcBorders>
             <w:tcMar>
               <w:start w:w="0" w:type="dxa"/>
@@ -7257,9 +7004,9 @@
             <w:tcW w:type="dxa" w:w="854"/>
             <w:tcBorders>
               <w:start w:sz="6.400000000000091" w:val="single" w:color="#E7E4DB"/>
-              <w:top w:sz="6.400000000000091" w:val="single" w:color="#E7E4DB"/>
+              <w:top w:sz="5.599999999999909" w:val="single" w:color="#E7E4DB"/>
               <w:end w:sz="5.599999999999909" w:val="single" w:color="#E7E4DB"/>
-              <w:bottom w:sz="6.400000000000091" w:val="single" w:color="#E7E4DB"/>
+              <w:bottom w:sz="5.599999999999909" w:val="single" w:color="#E7E4DB"/>
             </w:tcBorders>
             <w:tcMar>
               <w:start w:w="0" w:type="dxa"/>
@@ -7273,9 +7020,9 @@
             <w:tcW w:type="dxa" w:w="1696"/>
             <w:tcBorders>
               <w:start w:sz="5.599999999999909" w:val="single" w:color="#E7E4DB"/>
-              <w:top w:sz="6.400000000000091" w:val="single" w:color="#E7E4DB"/>
+              <w:top w:sz="5.599999999999909" w:val="single" w:color="#E7E4DB"/>
               <w:end w:sz="5.599999999999909" w:val="single" w:color="#E7E4DB"/>
-              <w:bottom w:sz="6.400000000000091" w:val="single" w:color="#E7E4DB"/>
+              <w:bottom w:sz="5.599999999999909" w:val="single" w:color="#E7E4DB"/>
             </w:tcBorders>
             <w:tcMar>
               <w:start w:w="0" w:type="dxa"/>
@@ -7289,9 +7036,9 @@
             <w:tcW w:type="dxa" w:w="1214"/>
             <w:tcBorders>
               <w:start w:sz="5.599999999999909" w:val="single" w:color="#E7E4DB"/>
-              <w:top w:sz="6.400000000000091" w:val="single" w:color="#E7E4DB"/>
+              <w:top w:sz="5.599999999999909" w:val="single" w:color="#E7E4DB"/>
               <w:end w:sz="6.399999999999636" w:val="single" w:color="#E7E4DB"/>
-              <w:bottom w:sz="6.400000000000091" w:val="single" w:color="#E7E4DB"/>
+              <w:bottom w:sz="5.599999999999909" w:val="single" w:color="#E7E4DB"/>
             </w:tcBorders>
             <w:tcMar>
               <w:start w:w="0" w:type="dxa"/>
@@ -7303,7 +7050,7 @@
               <w:autoSpaceDN w:val="0"/>
               <w:autoSpaceDE w:val="0"/>
               <w:widowControl/>
-              <w:spacing w:line="240" w:lineRule="auto" w:before="74" w:after="0"/>
+              <w:spacing w:line="240" w:lineRule="auto" w:before="76" w:after="0"/>
               <w:ind w:left="88" w:right="0" w:firstLine="0"/>
               <w:jc w:val="left"/>
             </w:pPr>
@@ -7330,9 +7077,9 @@
             <w:tcW w:type="dxa" w:w="720"/>
             <w:tcBorders>
               <w:start w:sz="6.399999999999977" w:val="single" w:color="#E7E4DB"/>
-              <w:top w:sz="6.400000000000091" w:val="single" w:color="#E7E4DB"/>
+              <w:top w:sz="5.599999999999909" w:val="single" w:color="#E7E4DB"/>
               <w:end w:sz="6.399999999999977" w:val="single" w:color="#E7E4DB"/>
-              <w:bottom w:sz="6.400000000000091" w:val="single" w:color="#E7E4DB"/>
+              <w:bottom w:sz="5.599999999999909" w:val="single" w:color="#E7E4DB"/>
             </w:tcBorders>
             <w:tcMar>
               <w:start w:w="0" w:type="dxa"/>
@@ -7346,9 +7093,9 @@
             <w:tcW w:type="dxa" w:w="4860"/>
             <w:tcBorders>
               <w:start w:sz="6.399999999999977" w:val="single" w:color="#E7E4DB"/>
-              <w:top w:sz="6.400000000000091" w:val="single" w:color="#E7E4DB"/>
+              <w:top w:sz="5.599999999999909" w:val="single" w:color="#E7E4DB"/>
               <w:end w:sz="6.400000000000091" w:val="single" w:color="#E7E4DB"/>
-              <w:bottom w:sz="6.400000000000091" w:val="single" w:color="#E7E4DB"/>
+              <w:bottom w:sz="5.599999999999909" w:val="single" w:color="#E7E4DB"/>
             </w:tcBorders>
             <w:tcMar>
               <w:start w:w="0" w:type="dxa"/>
@@ -7360,7 +7107,7 @@
               <w:autoSpaceDN w:val="0"/>
               <w:autoSpaceDE w:val="0"/>
               <w:widowControl/>
-              <w:spacing w:line="240" w:lineRule="auto" w:before="74" w:after="0"/>
+              <w:spacing w:line="240" w:lineRule="auto" w:before="76" w:after="0"/>
               <w:ind w:left="88" w:right="0" w:firstLine="0"/>
               <w:jc w:val="left"/>
             </w:pPr>
@@ -7382,9 +7129,9 @@
             <w:tcW w:type="dxa" w:w="720"/>
             <w:tcBorders>
               <w:start w:sz="6.400000000000091" w:val="single" w:color="#E7E4DB"/>
-              <w:top w:sz="6.400000000000091" w:val="single" w:color="#E7E4DB"/>
+              <w:top w:sz="5.599999999999909" w:val="single" w:color="#E7E4DB"/>
               <w:end w:sz="6.400000000000091" w:val="single" w:color="#E7E4DB"/>
-              <w:bottom w:sz="6.400000000000091" w:val="single" w:color="#E7E4DB"/>
+              <w:bottom w:sz="5.599999999999909" w:val="single" w:color="#E7E4DB"/>
             </w:tcBorders>
             <w:tcMar>
               <w:start w:w="0" w:type="dxa"/>
@@ -7398,9 +7145,9 @@
             <w:tcW w:type="dxa" w:w="854"/>
             <w:tcBorders>
               <w:start w:sz="6.400000000000091" w:val="single" w:color="#E7E4DB"/>
-              <w:top w:sz="6.400000000000091" w:val="single" w:color="#E7E4DB"/>
+              <w:top w:sz="5.599999999999909" w:val="single" w:color="#E7E4DB"/>
               <w:end w:sz="5.599999999999909" w:val="single" w:color="#E7E4DB"/>
-              <w:bottom w:sz="6.400000000000091" w:val="single" w:color="#E7E4DB"/>
+              <w:bottom w:sz="5.599999999999909" w:val="single" w:color="#E7E4DB"/>
             </w:tcBorders>
             <w:tcMar>
               <w:start w:w="0" w:type="dxa"/>
@@ -7414,9 +7161,9 @@
             <w:tcW w:type="dxa" w:w="1696"/>
             <w:tcBorders>
               <w:start w:sz="5.599999999999909" w:val="single" w:color="#E7E4DB"/>
-              <w:top w:sz="6.400000000000091" w:val="single" w:color="#E7E4DB"/>
+              <w:top w:sz="5.599999999999909" w:val="single" w:color="#E7E4DB"/>
               <w:end w:sz="5.599999999999909" w:val="single" w:color="#E7E4DB"/>
-              <w:bottom w:sz="6.400000000000091" w:val="single" w:color="#E7E4DB"/>
+              <w:bottom w:sz="5.599999999999909" w:val="single" w:color="#E7E4DB"/>
             </w:tcBorders>
             <w:tcMar>
               <w:start w:w="0" w:type="dxa"/>
@@ -7430,9 +7177,9 @@
             <w:tcW w:type="dxa" w:w="1214"/>
             <w:tcBorders>
               <w:start w:sz="5.599999999999909" w:val="single" w:color="#E7E4DB"/>
-              <w:top w:sz="6.400000000000091" w:val="single" w:color="#E7E4DB"/>
+              <w:top w:sz="5.599999999999909" w:val="single" w:color="#E7E4DB"/>
               <w:end w:sz="6.399999999999636" w:val="single" w:color="#E7E4DB"/>
-              <w:bottom w:sz="6.400000000000091" w:val="single" w:color="#E7E4DB"/>
+              <w:bottom w:sz="5.599999999999909" w:val="single" w:color="#E7E4DB"/>
             </w:tcBorders>
             <w:tcMar>
               <w:start w:w="0" w:type="dxa"/>
@@ -7444,7 +7191,7 @@
               <w:autoSpaceDN w:val="0"/>
               <w:autoSpaceDE w:val="0"/>
               <w:widowControl/>
-              <w:spacing w:line="240" w:lineRule="auto" w:before="74" w:after="0"/>
+              <w:spacing w:line="240" w:lineRule="auto" w:before="76" w:after="0"/>
               <w:ind w:left="0" w:right="0" w:firstLine="0"/>
               <w:jc w:val="center"/>
             </w:pPr>
@@ -7468,7 +7215,7 @@
         <w:autoSpaceDN w:val="0"/>
         <w:autoSpaceDE w:val="0"/>
         <w:widowControl/>
-        <w:spacing w:line="276" w:lineRule="auto" w:before="332" w:after="0"/>
+        <w:spacing w:line="276" w:lineRule="auto" w:before="316" w:after="0"/>
         <w:ind w:left="180" w:right="144" w:firstLine="0"/>
         <w:jc w:val="left"/>
       </w:pPr>
@@ -7568,7 +7315,7 @@
         <w:autoSpaceDN w:val="0"/>
         <w:autoSpaceDE w:val="0"/>
         <w:widowControl/>
-        <w:spacing w:line="240" w:lineRule="auto" w:before="196" w:after="0"/>
+        <w:spacing w:line="240" w:lineRule="auto" w:before="210" w:after="0"/>
         <w:ind w:left="180" w:right="0" w:firstLine="0"/>
         <w:jc w:val="left"/>
       </w:pPr>
@@ -7591,14 +7338,14 @@
         </w:tabs>
         <w:autoSpaceDE w:val="0"/>
         <w:widowControl/>
-        <w:spacing w:line="240" w:lineRule="auto" w:before="210" w:after="0"/>
+        <w:spacing w:line="240" w:lineRule="auto" w:before="196" w:after="0"/>
         <w:ind w:left="240" w:right="288" w:firstLine="0"/>
         <w:jc w:val="left"/>
       </w:pPr>
       <w:r>
         <w:drawing>
           <wp:inline xmlns:a="http://schemas.openxmlformats.org/drawingml/2006/main" xmlns:pic="http://schemas.openxmlformats.org/drawingml/2006/picture">
-            <wp:extent cx="63500" cy="63500"/>
+            <wp:extent cx="63500" cy="50800"/>
             <wp:docPr id="10" name="Picture 10"/>
             <wp:cNvGraphicFramePr>
               <a:graphicFrameLocks noChangeAspect="1"/>
@@ -7619,7 +7366,7 @@
                   <pic:spPr>
                     <a:xfrm>
                       <a:off x="0" y="0"/>
-                      <a:ext cx="63500" cy="63500"/>
+                      <a:ext cx="63500" cy="50800"/>
                     </a:xfrm>
                     <a:prstGeom prst="rect"/>
                   </pic:spPr>
@@ -7665,7 +7412,7 @@
       <w:r>
         <w:drawing>
           <wp:inline xmlns:a="http://schemas.openxmlformats.org/drawingml/2006/main" xmlns:pic="http://schemas.openxmlformats.org/drawingml/2006/picture">
-            <wp:extent cx="63500" cy="63500"/>
+            <wp:extent cx="63500" cy="50800"/>
             <wp:docPr id="11" name="Picture 11"/>
             <wp:cNvGraphicFramePr>
               <a:graphicFrameLocks noChangeAspect="1"/>
@@ -7686,7 +7433,7 @@
                   <pic:spPr>
                     <a:xfrm>
                       <a:off x="0" y="0"/>
-                      <a:ext cx="63500" cy="63500"/>
+                      <a:ext cx="63500" cy="50800"/>
                     </a:xfrm>
                     <a:prstGeom prst="rect"/>
                   </pic:spPr>
@@ -7722,7 +7469,7 @@
       <w:r>
         <w:drawing>
           <wp:inline xmlns:a="http://schemas.openxmlformats.org/drawingml/2006/main" xmlns:pic="http://schemas.openxmlformats.org/drawingml/2006/picture">
-            <wp:extent cx="63500" cy="63500"/>
+            <wp:extent cx="63500" cy="50800"/>
             <wp:docPr id="12" name="Picture 12"/>
             <wp:cNvGraphicFramePr>
               <a:graphicFrameLocks noChangeAspect="1"/>
@@ -7743,7 +7490,7 @@
                   <pic:spPr>
                     <a:xfrm>
                       <a:off x="0" y="0"/>
-                      <a:ext cx="63500" cy="63500"/>
+                      <a:ext cx="63500" cy="50800"/>
                     </a:xfrm>
                     <a:prstGeom prst="rect"/>
                   </pic:spPr>
@@ -7787,13 +7534,72 @@
     <w:p>
       <w:pPr>
         <w:autoSpaceDN w:val="0"/>
+        <w:autoSpaceDE w:val="0"/>
+        <w:widowControl/>
+        <w:spacing w:line="240" w:lineRule="auto" w:before="1236" w:after="0"/>
+        <w:ind w:left="0" w:right="28" w:firstLine="0"/>
+        <w:jc w:val="right"/>
+      </w:pPr>
+      <w:r>
+        <w:rPr>
+          <w:rFonts w:ascii="DejaVu Sans" w:hAnsi="DejaVu Sans" w:eastAsia="DejaVu Sans"/>
+          <w:b w:val="0"/>
+          <w:i w:val="0"/>
+          <w:color w:val="6B6B6B"/>
+          <w:sz w:val="12"/>
+        </w:rPr>
+        <w:t>Page 5 of 6</w:t>
+      </w:r>
+    </w:p>
+    <w:p>
+      <w:pPr>
+        <w:sectPr>
+          <w:pgSz w:w="12240" w:h="15840"/>
+          <w:pgMar w:top="146" w:right="880" w:bottom="150" w:left="900" w:header="720" w:footer="720" w:gutter="0"/>
+          <w:cols/>
+          <w:docGrid w:linePitch="360"/>
+        </w:sectPr>
+      </w:pPr>
+    </w:p>
+    <w:p>
+      <w:pPr>
+        <w:autoSpaceDN w:val="0"/>
+        <w:autoSpaceDE w:val="0"/>
+        <w:widowControl/>
+        <w:spacing w:line="148" w:lineRule="exact" w:before="0" w:after="0"/>
+        <w:ind w:left="0" w:right="0"/>
+      </w:pPr>
+    </w:p>
+    <w:p>
+      <w:pPr>
+        <w:autoSpaceDN w:val="0"/>
+        <w:autoSpaceDE w:val="0"/>
+        <w:widowControl/>
+        <w:spacing w:line="240" w:lineRule="auto" w:before="0" w:after="0"/>
+        <w:ind w:left="0" w:right="0" w:firstLine="0"/>
+        <w:jc w:val="left"/>
+      </w:pPr>
+      <w:r>
+        <w:rPr>
+          <w:rFonts w:ascii="DejaVu Sans" w:hAnsi="DejaVu Sans" w:eastAsia="DejaVu Sans"/>
+          <w:b w:val="0"/>
+          <w:i w:val="0"/>
+          <w:color w:val="6B6B6B"/>
+          <w:sz w:val="12"/>
+        </w:rPr>
+        <w:t>Opción E – Lámparas LED con driver integrado en cada punto, Locomotoras EMD</w:t>
+      </w:r>
+    </w:p>
+    <w:p>
+      <w:pPr>
+        <w:autoSpaceDN w:val="0"/>
         <w:tabs>
-          <w:tab w:pos="516" w:val="left"/>
+          <w:tab w:pos="508" w:val="left"/>
         </w:tabs>
         <w:autoSpaceDE w:val="0"/>
         <w:widowControl/>
-        <w:spacing w:line="240" w:lineRule="auto" w:before="194" w:after="0"/>
-        <w:ind w:left="240" w:right="1008" w:firstLine="0"/>
+        <w:spacing w:line="240" w:lineRule="auto" w:before="618" w:after="60"/>
+        <w:ind w:left="232" w:right="1008" w:firstLine="0"/>
         <w:jc w:val="left"/>
       </w:pPr>
       <w:r>
@@ -7851,179 +7657,6 @@
         <w:t>mínimos de 10 a 25 unidades.</w:t>
       </w:r>
     </w:p>
-    <w:p>
-      <w:pPr>
-        <w:autoSpaceDN w:val="0"/>
-        <w:tabs>
-          <w:tab w:pos="516" w:val="left"/>
-        </w:tabs>
-        <w:autoSpaceDE w:val="0"/>
-        <w:widowControl/>
-        <w:spacing w:line="240" w:lineRule="auto" w:before="120" w:after="0"/>
-        <w:ind w:left="240" w:right="0" w:firstLine="0"/>
-        <w:jc w:val="left"/>
-      </w:pPr>
-      <w:r>
-        <w:drawing>
-          <wp:inline xmlns:a="http://schemas.openxmlformats.org/drawingml/2006/main" xmlns:pic="http://schemas.openxmlformats.org/drawingml/2006/picture">
-            <wp:extent cx="63500" cy="50800"/>
-            <wp:docPr id="14" name="Picture 14"/>
-            <wp:cNvGraphicFramePr>
-              <a:graphicFrameLocks noChangeAspect="1"/>
-            </wp:cNvGraphicFramePr>
-            <a:graphic>
-              <a:graphicData uri="http://schemas.openxmlformats.org/drawingml/2006/picture">
-                <pic:pic>
-                  <pic:nvPicPr>
-                    <pic:cNvPr id="0" name="image.png"/>
-                    <pic:cNvPicPr/>
-                  </pic:nvPicPr>
-                  <pic:blipFill>
-                    <a:blip r:embed="rId16"/>
-                    <a:stretch>
-                      <a:fillRect/>
-                    </a:stretch>
-                  </pic:blipFill>
-                  <pic:spPr>
-                    <a:xfrm>
-                      <a:off x="0" y="0"/>
-                      <a:ext cx="63500" cy="50800"/>
-                    </a:xfrm>
-                    <a:prstGeom prst="rect"/>
-                  </pic:spPr>
-                </pic:pic>
-              </a:graphicData>
-            </a:graphic>
-          </wp:inline>
-        </w:drawing>
-      </w:r>
-      <w:r>
-        <w:rPr>
-          <w:rFonts w:ascii="Anthropic Sans Print" w:hAnsi="Anthropic Sans Print" w:eastAsia="Anthropic Sans Print"/>
-          <w:b w:val="0"/>
-          <w:i w:val="0"/>
-          <w:color w:val="1F1E1D"/>
-          <w:sz w:val="24"/>
-        </w:rPr>
-        <w:t>El rango de 50–85 V no cubre la falla del regulador ni los transitorios de EN 50155.</w:t>
-      </w:r>
-    </w:p>
-    <w:p>
-      <w:pPr>
-        <w:autoSpaceDN w:val="0"/>
-        <w:tabs>
-          <w:tab w:pos="516" w:val="left"/>
-        </w:tabs>
-        <w:autoSpaceDE w:val="0"/>
-        <w:widowControl/>
-        <w:spacing w:line="240" w:lineRule="auto" w:before="120" w:after="0"/>
-        <w:ind w:left="240" w:right="0" w:firstLine="0"/>
-        <w:jc w:val="left"/>
-      </w:pPr>
-      <w:r>
-        <w:drawing>
-          <wp:inline xmlns:a="http://schemas.openxmlformats.org/drawingml/2006/main" xmlns:pic="http://schemas.openxmlformats.org/drawingml/2006/picture">
-            <wp:extent cx="63500" cy="50800"/>
-            <wp:docPr id="15" name="Picture 15"/>
-            <wp:cNvGraphicFramePr>
-              <a:graphicFrameLocks noChangeAspect="1"/>
-            </wp:cNvGraphicFramePr>
-            <a:graphic>
-              <a:graphicData uri="http://schemas.openxmlformats.org/drawingml/2006/picture">
-                <pic:pic>
-                  <pic:nvPicPr>
-                    <pic:cNvPr id="0" name="image.png"/>
-                    <pic:cNvPicPr/>
-                  </pic:nvPicPr>
-                  <pic:blipFill>
-                    <a:blip r:embed="rId16"/>
-                    <a:stretch>
-                      <a:fillRect/>
-                    </a:stretch>
-                  </pic:blipFill>
-                  <pic:spPr>
-                    <a:xfrm>
-                      <a:off x="0" y="0"/>
-                      <a:ext cx="63500" cy="50800"/>
-                    </a:xfrm>
-                    <a:prstGeom prst="rect"/>
-                  </pic:spPr>
-                </pic:pic>
-              </a:graphicData>
-            </a:graphic>
-          </wp:inline>
-        </w:drawing>
-      </w:r>
-      <w:r>
-        <w:rPr>
-          <w:rFonts w:ascii="Anthropic Sans Print" w:hAnsi="Anthropic Sans Print" w:eastAsia="Anthropic Sans Print"/>
-          <w:b w:val="0"/>
-          <w:i w:val="0"/>
-          <w:color w:val="1F1E1D"/>
-          <w:sz w:val="24"/>
-        </w:rPr>
-        <w:t>Hay que mantener en bodega cinco tipos de lámpara distintos.</w:t>
-      </w:r>
-    </w:p>
-    <w:p>
-      <w:pPr>
-        <w:autoSpaceDN w:val="0"/>
-        <w:autoSpaceDE w:val="0"/>
-        <w:widowControl/>
-        <w:spacing w:line="240" w:lineRule="auto" w:before="772" w:after="0"/>
-        <w:ind w:left="0" w:right="28" w:firstLine="0"/>
-        <w:jc w:val="right"/>
-      </w:pPr>
-      <w:r>
-        <w:rPr>
-          <w:rFonts w:ascii="DejaVu Sans" w:hAnsi="DejaVu Sans" w:eastAsia="DejaVu Sans"/>
-          <w:b w:val="0"/>
-          <w:i w:val="0"/>
-          <w:color w:val="6B6B6B"/>
-          <w:sz w:val="12"/>
-        </w:rPr>
-        <w:t>Page 5 of 6</w:t>
-      </w:r>
-    </w:p>
-    <w:p>
-      <w:pPr>
-        <w:sectPr>
-          <w:pgSz w:w="12240" w:h="15840"/>
-          <w:pgMar w:top="146" w:right="880" w:bottom="150" w:left="900" w:header="720" w:footer="720" w:gutter="0"/>
-          <w:cols/>
-          <w:docGrid w:linePitch="360"/>
-        </w:sectPr>
-      </w:pPr>
-    </w:p>
-    <w:p>
-      <w:pPr>
-        <w:autoSpaceDN w:val="0"/>
-        <w:autoSpaceDE w:val="0"/>
-        <w:widowControl/>
-        <w:spacing w:line="148" w:lineRule="exact" w:before="0" w:after="0"/>
-        <w:ind w:left="0" w:right="0"/>
-      </w:pPr>
-    </w:p>
-    <w:p>
-      <w:pPr>
-        <w:autoSpaceDN w:val="0"/>
-        <w:autoSpaceDE w:val="0"/>
-        <w:widowControl/>
-        <w:spacing w:line="240" w:lineRule="auto" w:before="0" w:after="558"/>
-        <w:ind w:left="0" w:right="0" w:firstLine="0"/>
-        <w:jc w:val="left"/>
-      </w:pPr>
-      <w:r>
-        <w:rPr>
-          <w:rFonts w:ascii="DejaVu Sans" w:hAnsi="DejaVu Sans" w:eastAsia="DejaVu Sans"/>
-          <w:b w:val="0"/>
-          <w:i w:val="0"/>
-          <w:color w:val="6B6B6B"/>
-          <w:sz w:val="12"/>
-        </w:rPr>
-        <w:t>Opción E – Lámparas LED con driver integrado en cada punto, Locomotoras EMD</w:t>
-      </w:r>
-    </w:p>
     <w:tbl>
       <w:tblPr>
         <w:tblW w:type="auto" w:w="0"/>
@@ -8037,7 +7670,7 @@
       </w:tblGrid>
       <w:tr>
         <w:trPr>
-          <w:trHeight w:hRule="exact" w:val="420"/>
+          <w:trHeight w:hRule="exact" w:val="1260"/>
         </w:trPr>
         <w:tc>
           <w:tcPr>
@@ -8061,6 +7694,94 @@
               <w:drawing>
                 <wp:inline xmlns:a="http://schemas.openxmlformats.org/drawingml/2006/main" xmlns:pic="http://schemas.openxmlformats.org/drawingml/2006/picture">
                   <wp:extent cx="63500" cy="50800"/>
+                  <wp:docPr id="14" name="Picture 14"/>
+                  <wp:cNvGraphicFramePr>
+                    <a:graphicFrameLocks noChangeAspect="1"/>
+                  </wp:cNvGraphicFramePr>
+                  <a:graphic>
+                    <a:graphicData uri="http://schemas.openxmlformats.org/drawingml/2006/picture">
+                      <pic:pic>
+                        <pic:nvPicPr>
+                          <pic:cNvPr id="0" name="image.png"/>
+                          <pic:cNvPicPr/>
+                        </pic:nvPicPr>
+                        <pic:blipFill>
+                          <a:blip r:embed="rId15"/>
+                          <a:stretch>
+                            <a:fillRect/>
+                          </a:stretch>
+                        </pic:blipFill>
+                        <pic:spPr>
+                          <a:xfrm>
+                            <a:off x="0" y="0"/>
+                            <a:ext cx="63500" cy="50800"/>
+                          </a:xfrm>
+                          <a:prstGeom prst="rect"/>
+                        </pic:spPr>
+                      </pic:pic>
+                    </a:graphicData>
+                  </a:graphic>
+                </wp:inline>
+              </w:drawing>
+            </w:r>
+          </w:p>
+          <w:p>
+            <w:pPr>
+              <w:autoSpaceDN w:val="0"/>
+              <w:autoSpaceDE w:val="0"/>
+              <w:widowControl/>
+              <w:spacing w:line="240" w:lineRule="auto" w:before="340" w:after="0"/>
+              <w:ind w:left="0" w:right="0" w:firstLine="0"/>
+              <w:jc w:val="center"/>
+            </w:pPr>
+            <w:r>
+              <w:drawing>
+                <wp:inline xmlns:a="http://schemas.openxmlformats.org/drawingml/2006/main" xmlns:pic="http://schemas.openxmlformats.org/drawingml/2006/picture">
+                  <wp:extent cx="63500" cy="50800"/>
+                  <wp:docPr id="15" name="Picture 15"/>
+                  <wp:cNvGraphicFramePr>
+                    <a:graphicFrameLocks noChangeAspect="1"/>
+                  </wp:cNvGraphicFramePr>
+                  <a:graphic>
+                    <a:graphicData uri="http://schemas.openxmlformats.org/drawingml/2006/picture">
+                      <pic:pic>
+                        <pic:nvPicPr>
+                          <pic:cNvPr id="0" name="image.png"/>
+                          <pic:cNvPicPr/>
+                        </pic:nvPicPr>
+                        <pic:blipFill>
+                          <a:blip r:embed="rId15"/>
+                          <a:stretch>
+                            <a:fillRect/>
+                          </a:stretch>
+                        </pic:blipFill>
+                        <pic:spPr>
+                          <a:xfrm>
+                            <a:off x="0" y="0"/>
+                            <a:ext cx="63500" cy="50800"/>
+                          </a:xfrm>
+                          <a:prstGeom prst="rect"/>
+                        </pic:spPr>
+                      </pic:pic>
+                    </a:graphicData>
+                  </a:graphic>
+                </wp:inline>
+              </w:drawing>
+            </w:r>
+          </w:p>
+          <w:p>
+            <w:pPr>
+              <w:autoSpaceDN w:val="0"/>
+              <w:autoSpaceDE w:val="0"/>
+              <w:widowControl/>
+              <w:spacing w:line="240" w:lineRule="auto" w:before="340" w:after="0"/>
+              <w:ind w:left="0" w:right="0" w:firstLine="0"/>
+              <w:jc w:val="center"/>
+            </w:pPr>
+            <w:r>
+              <w:drawing>
+                <wp:inline xmlns:a="http://schemas.openxmlformats.org/drawingml/2006/main" xmlns:pic="http://schemas.openxmlformats.org/drawingml/2006/picture">
+                  <wp:extent cx="63500" cy="50800"/>
                   <wp:docPr id="16" name="Picture 16"/>
                   <wp:cNvGraphicFramePr>
                     <a:graphicFrameLocks noChangeAspect="1"/>
@@ -8073,7 +7794,7 @@
                           <pic:cNvPicPr/>
                         </pic:nvPicPr>
                         <pic:blipFill>
-                          <a:blip r:embed="rId17"/>
+                          <a:blip r:embed="rId15"/>
                           <a:stretch>
                             <a:fillRect/>
                           </a:stretch>
@@ -8095,7 +7816,7 @@
         </w:tc>
         <w:tc>
           <w:tcPr>
-            <w:tcW w:type="dxa" w:w="9520"/>
+            <w:tcW w:type="dxa" w:w="9560"/>
             <w:tcBorders/>
             <w:tcMar>
               <w:start w:w="0" w:type="dxa"/>
@@ -8107,7 +7828,37 @@
               <w:autoSpaceDN w:val="0"/>
               <w:autoSpaceDE w:val="0"/>
               <w:widowControl/>
-              <w:spacing w:line="240" w:lineRule="auto" w:before="60" w:after="0"/>
+              <w:spacing w:line="288" w:lineRule="auto" w:before="60" w:after="0"/>
+              <w:ind w:left="96" w:right="432" w:firstLine="0"/>
+              <w:jc w:val="left"/>
+            </w:pPr>
+            <w:r>
+              <w:rPr>
+                <w:rFonts w:ascii="Anthropic Sans Print" w:hAnsi="Anthropic Sans Print" w:eastAsia="Anthropic Sans Print"/>
+                <w:b w:val="0"/>
+                <w:i w:val="0"/>
+                <w:color w:val="1F1E1D"/>
+                <w:sz w:val="24"/>
+              </w:rPr>
+              <w:t xml:space="preserve">El rango de 50–85 V no cubre la falla del regulador ni los transitorios de EN 50155. </w:t>
+            </w:r>
+            <w:r>
+              <w:rPr>
+                <w:rFonts w:ascii="Anthropic Sans Print" w:hAnsi="Anthropic Sans Print" w:eastAsia="Anthropic Sans Print"/>
+                <w:b w:val="0"/>
+                <w:i w:val="0"/>
+                <w:color w:val="1F1E1D"/>
+                <w:sz w:val="24"/>
+              </w:rPr>
+              <w:t>Hay que mantener en bodega cinco tipos de lámpara distintos.</w:t>
+            </w:r>
+          </w:p>
+          <w:p>
+            <w:pPr>
+              <w:autoSpaceDN w:val="0"/>
+              <w:autoSpaceDE w:val="0"/>
+              <w:widowControl/>
+              <w:spacing w:line="240" w:lineRule="auto" w:before="120" w:after="0"/>
               <w:ind w:left="96" w:right="0" w:firstLine="0"/>
               <w:jc w:val="left"/>
             </w:pPr>
@@ -8156,7 +7907,7 @@
             <w:tcW w:type="dxa" w:w="2968"/>
             <w:tcBorders>
               <w:start w:sz="6.399999999999977" w:val="single" w:color="#E7E4DB"/>
-              <w:top w:sz="5.600000000000023" w:val="single" w:color="#E7E4DB"/>
+              <w:top w:sz="5.599999999999909" w:val="single" w:color="#E7E4DB"/>
               <w:end w:sz="5.599999999999909" w:val="single" w:color="#E7E4DB"/>
               <w:bottom w:sz="5.599999999999909" w:val="single" w:color="#E7E4DB"/>
             </w:tcBorders>
@@ -8193,7 +7944,7 @@
             <w:tcW w:type="dxa" w:w="2116"/>
             <w:tcBorders>
               <w:start w:sz="5.599999999999909" w:val="single" w:color="#E7E4DB"/>
-              <w:top w:sz="5.600000000000023" w:val="single" w:color="#E7E4DB"/>
+              <w:top w:sz="5.599999999999909" w:val="single" w:color="#E7E4DB"/>
               <w:end w:sz="6.400000000000091" w:val="single" w:color="#E7E4DB"/>
               <w:bottom w:sz="5.599999999999909" w:val="single" w:color="#E7E4DB"/>
             </w:tcBorders>
@@ -8230,7 +7981,7 @@
             <w:tcW w:type="dxa" w:w="2116"/>
             <w:tcBorders>
               <w:start w:sz="6.400000000000091" w:val="single" w:color="#E7E4DB"/>
-              <w:top w:sz="5.600000000000023" w:val="single" w:color="#E7E4DB"/>
+              <w:top w:sz="5.599999999999909" w:val="single" w:color="#E7E4DB"/>
               <w:end w:sz="6.400000000000091" w:val="single" w:color="#E7E4DB"/>
               <w:bottom w:sz="5.599999999999909" w:val="single" w:color="#E7E4DB"/>
             </w:tcBorders>
@@ -8281,7 +8032,7 @@
             <w:tcW w:type="dxa" w:w="2864"/>
             <w:tcBorders>
               <w:start w:sz="6.400000000000091" w:val="single" w:color="#E7E4DB"/>
-              <w:top w:sz="5.600000000000023" w:val="single" w:color="#E7E4DB"/>
+              <w:top w:sz="5.599999999999909" w:val="single" w:color="#E7E4DB"/>
               <w:end w:sz="6.399999999999636" w:val="single" w:color="#E7E4DB"/>
               <w:bottom w:sz="5.599999999999909" w:val="single" w:color="#E7E4DB"/>
             </w:tcBorders>
@@ -9487,7 +9238,7 @@
               <w:start w:sz="6.399999999999977" w:val="single" w:color="#E7E4DB"/>
               <w:top w:sz="5.599999999999909" w:val="single" w:color="#E7E4DB"/>
               <w:end w:sz="5.599999999999909" w:val="single" w:color="#E7E4DB"/>
-              <w:bottom w:sz="6.400000000000091" w:val="single" w:color="#E7E4DB"/>
+              <w:bottom w:sz="6.399999999999636" w:val="single" w:color="#E7E4DB"/>
             </w:tcBorders>
             <w:tcMar>
               <w:start w:w="0" w:type="dxa"/>
@@ -9523,7 +9274,7 @@
               <w:start w:sz="5.599999999999909" w:val="single" w:color="#E7E4DB"/>
               <w:top w:sz="5.599999999999909" w:val="single" w:color="#E7E4DB"/>
               <w:end w:sz="6.400000000000091" w:val="single" w:color="#E7E4DB"/>
-              <w:bottom w:sz="6.400000000000091" w:val="single" w:color="#E7E4DB"/>
+              <w:bottom w:sz="6.399999999999636" w:val="single" w:color="#E7E4DB"/>
             </w:tcBorders>
             <w:tcMar>
               <w:start w:w="0" w:type="dxa"/>
@@ -9559,7 +9310,7 @@
               <w:start w:sz="6.400000000000091" w:val="single" w:color="#E7E4DB"/>
               <w:top w:sz="5.599999999999909" w:val="single" w:color="#E7E4DB"/>
               <w:end w:sz="6.400000000000091" w:val="single" w:color="#E7E4DB"/>
-              <w:bottom w:sz="6.400000000000091" w:val="single" w:color="#E7E4DB"/>
+              <w:bottom w:sz="6.399999999999636" w:val="single" w:color="#E7E4DB"/>
             </w:tcBorders>
             <w:tcMar>
               <w:start w:w="0" w:type="dxa"/>
@@ -9595,7 +9346,7 @@
               <w:start w:sz="6.400000000000091" w:val="single" w:color="#E7E4DB"/>
               <w:top w:sz="5.599999999999909" w:val="single" w:color="#E7E4DB"/>
               <w:end w:sz="6.399999999999636" w:val="single" w:color="#E7E4DB"/>
-              <w:bottom w:sz="6.400000000000091" w:val="single" w:color="#E7E4DB"/>
+              <w:bottom w:sz="6.399999999999636" w:val="single" w:color="#E7E4DB"/>
             </w:tcBorders>
             <w:tcMar>
               <w:start w:w="0" w:type="dxa"/>
@@ -9656,7 +9407,7 @@
         <w:autoSpaceDN w:val="0"/>
         <w:autoSpaceDE w:val="0"/>
         <w:widowControl/>
-        <w:spacing w:line="240" w:lineRule="auto" w:before="5978" w:after="0"/>
+        <w:spacing w:line="240" w:lineRule="auto" w:before="4358" w:after="0"/>
         <w:ind w:left="0" w:right="20" w:firstLine="0"/>
         <w:jc w:val="right"/>
       </w:pPr>

</xml_diff>